<commit_message>
Add one-page A4 docx builder
</commit_message>
<xml_diff>
--- a/pet-coach-A4.docx
+++ b/pet-coach-A4.docx
@@ -4,320 +4,1292 @@
   <w:body>
     <w:p>
       <w:pPr>
-        <w:pStyle w:val="Title"/>
-        <w:spacing w:after="24" w:line="245" w:lineRule="auto"/>
+        <w:spacing w:after="10" w:before="0" w:line="240" w:lineRule="auto"/>
+        <w:jc w:val="center"/>
       </w:pPr>
       <w:r>
         <w:rPr>
-          <w:rFonts w:ascii="PingFang SC" w:hAnsi="PingFang SC" w:eastAsia="PingFang SC"/>
+          <w:b/>
+          <w:color w:val="2F5B4C"/>
+          <w:sz w:val="27"/>
         </w:rPr>
         <w:t>陪训 PetCoach · AI 宠物行为训练教练</w:t>
       </w:r>
     </w:p>
     <w:p>
       <w:pPr>
-        <w:spacing w:after="24" w:line="245" w:lineRule="auto"/>
+        <w:spacing w:after="30" w:before="0" w:line="240" w:lineRule="auto"/>
+        <w:jc w:val="center"/>
       </w:pPr>
       <w:r>
         <w:rPr>
-          <w:rFonts w:ascii="PingFang SC" w:hAnsi="PingFang SC" w:eastAsia="PingFang SC"/>
+          <w:b w:val="0"/>
+          <w:color w:val="666666"/>
+          <w:sz w:val="18"/>
+        </w:rPr>
+        <w:t>方向：宠物 AI　｜　一句话：免费训狗教程铺天盖地，但新手养狗人常在见效前就放弃。PetCoach 用 AI 把口语描述转成</w:t>
+      </w:r>
+      <w:r>
+        <w:rPr>
           <w:b/>
-          <w:sz w:val="14"/>
+          <w:color w:val="666666"/>
+          <w:sz w:val="18"/>
         </w:rPr>
-        <w:t>一句话：免费教程很多，但新手养狗人坚持不到训练见效；PetCoach 用 AI 把口语描述转成诊断、分级、分周计划和每日任务，并用本地打卡/次日提示演示“陪主人坚持”的最小闭环。</w:t>
+        <w:t>行为诊断 → 严重度分级 → 分周训练计划 → 每日任务</w:t>
+      </w:r>
+      <w:r>
+        <w:rPr>
+          <w:b w:val="0"/>
+          <w:color w:val="666666"/>
+          <w:sz w:val="18"/>
+        </w:rPr>
+        <w:t>，并以打卡 + 规则化次日提示演示“陪主人坚持”的最小闭环——</w:t>
+      </w:r>
+      <w:r>
+        <w:rPr>
+          <w:b/>
+          <w:color w:val="666666"/>
+          <w:sz w:val="18"/>
+        </w:rPr>
+        <w:t>我们卖的不是知识，是坚持到见效</w:t>
+      </w:r>
+      <w:r>
+        <w:rPr>
+          <w:b w:val="0"/>
+          <w:color w:val="666666"/>
+          <w:sz w:val="18"/>
+        </w:rPr>
+        <w:t>。</w:t>
       </w:r>
     </w:p>
     <w:p>
       <w:pPr>
-        <w:pStyle w:val="Heading1"/>
-        <w:spacing w:after="24" w:line="245" w:lineRule="auto"/>
+        <w:spacing w:after="24" w:before="60" w:line="240" w:lineRule="auto"/>
       </w:pPr>
       <w:r>
         <w:rPr>
-          <w:rFonts w:ascii="PingFang SC" w:hAnsi="PingFang SC" w:eastAsia="PingFang SC"/>
+          <w:b/>
+          <w:color w:val="2F5B4C"/>
+          <w:sz w:val="20"/>
         </w:rPr>
         <w:t>① 机会判断</w:t>
       </w:r>
     </w:p>
     <w:p>
       <w:pPr>
-        <w:spacing w:after="14"/>
-        <w:ind w:left="125" w:hanging="79"/>
+        <w:spacing w:after="16" w:before="0" w:line="240" w:lineRule="auto"/>
+        <w:ind w:left="227"/>
       </w:pPr>
       <w:r>
         <w:rPr>
-          <w:rFonts w:ascii="PingFang SC" w:hAnsi="PingFang SC" w:eastAsia="PingFang SC"/>
-          <w:sz w:val="14"/>
+          <w:b w:val="0"/>
+          <w:color w:val="222222"/>
+          <w:sz w:val="18"/>
         </w:rPr>
-        <w:t>• 目标用户：城市 90/00 后新手养狗人（狗 0-3 岁），被拆家、分离焦虑、乱尿、乱叫击穿。白皮书报道 90 后宠主 42.7%、00 后 26.3%。</w:t>
+        <w:t xml:space="preserve">• </w:t>
+      </w:r>
+      <w:r>
+        <w:rPr>
+          <w:b/>
+          <w:color w:val="222222"/>
+          <w:sz w:val="18"/>
+        </w:rPr>
+        <w:t>目标用户</w:t>
+      </w:r>
+      <w:r>
+        <w:rPr>
+          <w:b w:val="0"/>
+          <w:color w:val="222222"/>
+          <w:sz w:val="18"/>
+        </w:rPr>
+        <w:t xml:space="preserve">：一线 / 新一线城市 90、00 后新手养狗人（狗 0–3 岁），独居或上班族，被拆家、分离焦虑、随地大小便、乱吠、扑人咬人击穿。白皮书报道 90 后占宠主 </w:t>
+      </w:r>
+      <w:r>
+        <w:rPr>
+          <w:b/>
+          <w:color w:val="222222"/>
+          <w:sz w:val="18"/>
+        </w:rPr>
+        <w:t>42.7%</w:t>
+      </w:r>
+      <w:r>
+        <w:rPr>
+          <w:b w:val="0"/>
+          <w:color w:val="222222"/>
+          <w:sz w:val="18"/>
+        </w:rPr>
+        <w:t xml:space="preserve">、00 后 </w:t>
+      </w:r>
+      <w:r>
+        <w:rPr>
+          <w:b/>
+          <w:color w:val="222222"/>
+          <w:sz w:val="18"/>
+        </w:rPr>
+        <w:t>26.3%</w:t>
+      </w:r>
+      <w:r>
+        <w:rPr>
+          <w:b w:val="0"/>
+          <w:color w:val="222222"/>
+          <w:sz w:val="18"/>
+        </w:rPr>
+        <w:t>（增速最快）。</w:t>
       </w:r>
     </w:p>
     <w:p>
       <w:pPr>
-        <w:spacing w:after="14"/>
-        <w:ind w:left="125" w:hanging="79"/>
+        <w:spacing w:after="16" w:before="0" w:line="240" w:lineRule="auto"/>
+        <w:ind w:left="227"/>
       </w:pPr>
       <w:r>
         <w:rPr>
-          <w:rFonts w:ascii="PingFang SC" w:hAnsi="PingFang SC" w:eastAsia="PingFang SC"/>
-          <w:sz w:val="14"/>
+          <w:b w:val="0"/>
+          <w:color w:val="222222"/>
+          <w:sz w:val="18"/>
         </w:rPr>
-        <w:t>• 核心痛点：缺的不是方法，是坚持与反馈；训练常要数周至数月，线下训练动辄几千元，免费视频不个性化、无反馈。</w:t>
+        <w:t xml:space="preserve">• </w:t>
+      </w:r>
+      <w:r>
+        <w:rPr>
+          <w:b/>
+          <w:color w:val="222222"/>
+          <w:sz w:val="18"/>
+        </w:rPr>
+        <w:t>核心痛点</w:t>
+      </w:r>
+      <w:r>
+        <w:rPr>
+          <w:b w:val="0"/>
+          <w:color w:val="222222"/>
+          <w:sz w:val="18"/>
+        </w:rPr>
+        <w:t>：缺的不是方法，是</w:t>
+      </w:r>
+      <w:r>
+        <w:rPr>
+          <w:b/>
+          <w:color w:val="222222"/>
+          <w:sz w:val="18"/>
+        </w:rPr>
+        <w:t>坚持与反馈</w:t>
+      </w:r>
+      <w:r>
+        <w:rPr>
+          <w:b w:val="0"/>
+          <w:color w:val="222222"/>
+          <w:sz w:val="18"/>
+        </w:rPr>
+        <w:t>。训练见效常需</w:t>
+      </w:r>
+      <w:r>
+        <w:rPr>
+          <w:b/>
+          <w:color w:val="222222"/>
+          <w:sz w:val="18"/>
+        </w:rPr>
+        <w:t>数周至数月</w:t>
+      </w:r>
+      <w:r>
+        <w:rPr>
+          <w:b w:val="0"/>
+          <w:color w:val="222222"/>
+          <w:sz w:val="18"/>
+        </w:rPr>
+        <w:t xml:space="preserve">，用户却往往几天就放弃；线下代训 </w:t>
+      </w:r>
+      <w:r>
+        <w:rPr>
+          <w:b/>
+          <w:color w:val="222222"/>
+          <w:sz w:val="18"/>
+        </w:rPr>
+        <w:t>¥1000–5800/月甚至上万</w:t>
+      </w:r>
+      <w:r>
+        <w:rPr>
+          <w:b w:val="0"/>
+          <w:color w:val="222222"/>
+          <w:sz w:val="18"/>
+        </w:rPr>
+        <w:t>且“回家就反弹”；免费视频不个性化、无反馈、不纠错。</w:t>
       </w:r>
     </w:p>
     <w:p>
       <w:pPr>
-        <w:spacing w:after="14"/>
-        <w:ind w:left="125" w:hanging="79"/>
+        <w:spacing w:after="16" w:before="0" w:line="240" w:lineRule="auto"/>
+        <w:ind w:left="227"/>
       </w:pPr>
       <w:r>
         <w:rPr>
-          <w:rFonts w:ascii="PingFang SC" w:hAnsi="PingFang SC" w:eastAsia="PingFang SC"/>
-          <w:sz w:val="14"/>
+          <w:b w:val="0"/>
+          <w:color w:val="222222"/>
+          <w:sz w:val="18"/>
         </w:rPr>
-        <w:t>• 为什么现在：2025 城镇犬猫消费 3126 亿元，服务占比仅 6.5%；多模态 LLM 未来可做视频反馈，当前 Demo 先用文本模型跑通主线。核心风险：打卡 App 本身留存也差，必须用真实 D14 留存验证。</w:t>
+        <w:t xml:space="preserve">• </w:t>
+      </w:r>
+      <w:r>
+        <w:rPr>
+          <w:b/>
+          <w:color w:val="222222"/>
+          <w:sz w:val="18"/>
+        </w:rPr>
+        <w:t>为什么现在</w:t>
+      </w:r>
+      <w:r>
+        <w:rPr>
+          <w:b w:val="0"/>
+          <w:color w:val="222222"/>
+          <w:sz w:val="18"/>
+        </w:rPr>
+        <w:t xml:space="preserve">：① 2025 城镇犬猫消费 </w:t>
+      </w:r>
+      <w:r>
+        <w:rPr>
+          <w:b/>
+          <w:color w:val="222222"/>
+          <w:sz w:val="18"/>
+        </w:rPr>
+        <w:t>3126 亿</w:t>
+      </w:r>
+      <w:r>
+        <w:rPr>
+          <w:b w:val="0"/>
+          <w:color w:val="222222"/>
+          <w:sz w:val="18"/>
+        </w:rPr>
+        <w:t xml:space="preserve">，服务占比仅 </w:t>
+      </w:r>
+      <w:r>
+        <w:rPr>
+          <w:b/>
+          <w:color w:val="222222"/>
+          <w:sz w:val="18"/>
+        </w:rPr>
+        <w:t>6.5%</w:t>
+      </w:r>
+      <w:r>
+        <w:rPr>
+          <w:b w:val="0"/>
+          <w:color w:val="222222"/>
+          <w:sz w:val="18"/>
+        </w:rPr>
+        <w:t>（医疗 27.6%），渗透率洼地；② 付费主力换成习惯 App/AI 订阅打卡的 90/00 后；③ 多模态 LLM 边际成本趋零，未来可“看视频给即时反馈”，是唯一能做高频微反馈的形态（当前先用文本模型跑通主线）；④ 线下“买证、粗暴训练、代训反弹”信任崩塌，透明正向强化成为现成卖点。</w:t>
       </w:r>
     </w:p>
     <w:p>
       <w:pPr>
-        <w:pStyle w:val="Heading1"/>
-        <w:spacing w:after="24" w:line="245" w:lineRule="auto"/>
+        <w:spacing w:after="16" w:before="0" w:line="240" w:lineRule="auto"/>
+        <w:ind w:left="227"/>
       </w:pPr>
       <w:r>
         <w:rPr>
-          <w:rFonts w:ascii="PingFang SC" w:hAnsi="PingFang SC" w:eastAsia="PingFang SC"/>
+          <w:b w:val="0"/>
+          <w:color w:val="222222"/>
+          <w:sz w:val="18"/>
+        </w:rPr>
+        <w:t xml:space="preserve">• </w:t>
+      </w:r>
+      <w:r>
+        <w:rPr>
+          <w:b/>
+          <w:color w:val="222222"/>
+          <w:sz w:val="18"/>
+        </w:rPr>
+        <w:t>主动亮风险</w:t>
+      </w:r>
+      <w:r>
+        <w:rPr>
+          <w:b w:val="0"/>
+          <w:color w:val="222222"/>
+          <w:sz w:val="18"/>
+        </w:rPr>
+        <w:t>：打卡 / 习惯类 App 自身留存也差——用户凭什么对我的 App 坚持数周？“AI 能否真正提升坚持率”是本方向命门，必须用真实 D14 留存验证，而非靠 Demo 说服。</w:t>
+      </w:r>
+    </w:p>
+    <w:p>
+      <w:pPr>
+        <w:spacing w:after="24" w:before="60" w:line="240" w:lineRule="auto"/>
+      </w:pPr>
+      <w:r>
+        <w:rPr>
+          <w:b/>
+          <w:color w:val="2F5B4C"/>
+          <w:sz w:val="20"/>
         </w:rPr>
         <w:t>② 用户证据（可核查链接 + 社群观察）</w:t>
       </w:r>
     </w:p>
     <w:p>
       <w:pPr>
-        <w:spacing w:after="14"/>
-        <w:ind w:left="125" w:hanging="79"/>
+        <w:spacing w:after="16" w:before="0" w:line="240" w:lineRule="auto"/>
+        <w:ind w:left="227"/>
       </w:pPr>
       <w:r>
         <w:rPr>
-          <w:rFonts w:ascii="PingFang SC" w:hAnsi="PingFang SC" w:eastAsia="PingFang SC"/>
-          <w:sz w:val="14"/>
+          <w:b w:val="0"/>
+          <w:color w:val="222222"/>
+          <w:sz w:val="18"/>
         </w:rPr>
-        <w:t>• 公开链接：知乎分离焦虑讨论反复出现嚎叫、刨门、破坏等求助；央视网/CBNData/羊城晚报报道线下训练几千到上万元，基础服从普遍高于 3000 元，也有机构 5800 元/月；央视网白皮书报道 2025 城镇犬猫消费 3126 亿元、单犬年均 3006 元、服务占比 6.5%。</w:t>
+        <w:t xml:space="preserve">• </w:t>
+      </w:r>
+      <w:r>
+        <w:rPr>
+          <w:b/>
+          <w:color w:val="222222"/>
+          <w:sz w:val="18"/>
+        </w:rPr>
+        <w:t>痛点高频（公开讨论）</w:t>
+      </w:r>
+      <w:r>
+        <w:rPr>
+          <w:b w:val="0"/>
+          <w:color w:val="222222"/>
+          <w:sz w:val="18"/>
+        </w:rPr>
+        <w:t xml:space="preserve">：知乎分离焦虑讨论反复出现“嚎叫、刨门、破坏、独处焦虑”求助（知乎问答 / 专栏）；权威科普将分离焦虑症状列为吠叫 / 嚎叫、啃咬抓门、踱步（Farmina）。分离焦虑占犬行为问题约 </w:t>
+      </w:r>
+      <w:r>
+        <w:rPr>
+          <w:b/>
+          <w:color w:val="222222"/>
+          <w:sz w:val="18"/>
+        </w:rPr>
+        <w:t>20–40%</w:t>
+      </w:r>
+      <w:r>
+        <w:rPr>
+          <w:b w:val="0"/>
+          <w:color w:val="222222"/>
+          <w:sz w:val="18"/>
+        </w:rPr>
+        <w:t>。</w:t>
       </w:r>
     </w:p>
     <w:p>
       <w:pPr>
-        <w:spacing w:after="14"/>
-        <w:ind w:left="125" w:hanging="79"/>
+        <w:spacing w:after="16" w:before="0" w:line="240" w:lineRule="auto"/>
+        <w:ind w:left="227"/>
       </w:pPr>
       <w:r>
         <w:rPr>
-          <w:rFonts w:ascii="PingFang SC" w:hAnsi="PingFang SC" w:eastAsia="PingFang SC"/>
-          <w:sz w:val="14"/>
+          <w:b w:val="0"/>
+          <w:color w:val="222222"/>
+          <w:sz w:val="18"/>
         </w:rPr>
-        <w:t>• 小红书/淘宝真实评论（社群观察）：小红书用户“出门练习这个点，要等狗不叫了再回来，还是就是出门两分钟就回来，不管它叫不叫”；淘宝训犬课买家“之前还花了快一万块把他送去训狗基地，原本有好转了但是一出门还是被打回原形，疯狂拆家，有吃的也不吃，已经被投诉好几次了，讲真的这种狗已经想弃养了”。截图见仓库 evidence/ 目录。</w:t>
+        <w:t xml:space="preserve">• </w:t>
+      </w:r>
+      <w:r>
+        <w:rPr>
+          <w:b/>
+          <w:color w:val="222222"/>
+          <w:sz w:val="18"/>
+        </w:rPr>
+        <w:t>成熟付费市场</w:t>
+      </w:r>
+      <w:r>
+        <w:rPr>
+          <w:b w:val="0"/>
+          <w:color w:val="222222"/>
+          <w:sz w:val="18"/>
+        </w:rPr>
+        <w:t xml:space="preserve">：羊城晚报报道到府课 </w:t>
+      </w:r>
+      <w:r>
+        <w:rPr>
+          <w:b/>
+          <w:color w:val="222222"/>
+          <w:sz w:val="18"/>
+        </w:rPr>
+        <w:t>¥1000–3000/节</w:t>
+      </w:r>
+      <w:r>
+        <w:rPr>
+          <w:b w:val="0"/>
+          <w:color w:val="222222"/>
+          <w:sz w:val="18"/>
+        </w:rPr>
+        <w:t xml:space="preserve">；CBNData / 市值榜报道基础服从训练普遍 </w:t>
+      </w:r>
+      <w:r>
+        <w:rPr>
+          <w:b/>
+          <w:color w:val="222222"/>
+          <w:sz w:val="18"/>
+        </w:rPr>
+        <w:t>&gt;¥3000</w:t>
+      </w:r>
+      <w:r>
+        <w:rPr>
+          <w:b w:val="0"/>
+          <w:color w:val="222222"/>
+          <w:sz w:val="18"/>
+        </w:rPr>
+        <w:t xml:space="preserve">、有机构 </w:t>
+      </w:r>
+      <w:r>
+        <w:rPr>
+          <w:b/>
+          <w:color w:val="222222"/>
+          <w:sz w:val="18"/>
+        </w:rPr>
+        <w:t>¥5800/月</w:t>
+      </w:r>
+      <w:r>
+        <w:rPr>
+          <w:b w:val="0"/>
+          <w:color w:val="222222"/>
+          <w:sz w:val="18"/>
+        </w:rPr>
+        <w:t xml:space="preserve">；央视网报道宠物学校 1–2 个月 </w:t>
+      </w:r>
+      <w:r>
+        <w:rPr>
+          <w:b/>
+          <w:color w:val="222222"/>
+          <w:sz w:val="18"/>
+        </w:rPr>
+        <w:t>¥3500–4500</w:t>
+      </w:r>
+      <w:r>
+        <w:rPr>
+          <w:b w:val="0"/>
+          <w:color w:val="222222"/>
+          <w:sz w:val="18"/>
+        </w:rPr>
+        <w:t>、线下训练从几千到上万——即使效果不稳定，用户仍在花钱。</w:t>
       </w:r>
     </w:p>
     <w:p>
       <w:pPr>
-        <w:spacing w:after="14"/>
-        <w:ind w:left="125" w:hanging="79"/>
+        <w:spacing w:after="16" w:before="0" w:line="240" w:lineRule="auto"/>
+        <w:ind w:left="227"/>
       </w:pPr>
       <w:r>
         <w:rPr>
-          <w:rFonts w:ascii="PingFang SC" w:hAnsi="PingFang SC" w:eastAsia="PingFang SC"/>
-          <w:sz w:val="14"/>
+          <w:b w:val="0"/>
+          <w:color w:val="222222"/>
+          <w:sz w:val="18"/>
         </w:rPr>
-        <w:t>• 证据强度自陈：以上主要是公开网络资料/桌面调研和社群观察，尚未做一手访谈；“3-7 天放弃”仍是待验证假设。</w:t>
+        <w:t xml:space="preserve">• </w:t>
+      </w:r>
+      <w:r>
+        <w:rPr>
+          <w:b/>
+          <w:color w:val="222222"/>
+          <w:sz w:val="18"/>
+        </w:rPr>
+        <w:t>小红书 / 淘宝真实评论（社群观察）</w:t>
+      </w:r>
+      <w:r>
+        <w:rPr>
+          <w:b w:val="0"/>
+          <w:color w:val="222222"/>
+          <w:sz w:val="18"/>
+        </w:rPr>
+        <w:t>：小红书用户“出门练习这个点，要等狗不叫了再回来，还是就是出门两分钟就回来，不管它叫不叫”（反映方法执行难、缺即时反馈）；淘宝训犬课买家“之前还花了快一万块把他送去训狗基地，原本有好转了但一出门还是被打回原形，疯狂拆家，有吃的也不吃，已经被投诉好几次了……已经想弃养了”（线下贵且反弹、痛点极强）。原始截图见代码仓库 evidence/ 目录。</w:t>
       </w:r>
     </w:p>
     <w:p>
       <w:pPr>
-        <w:pStyle w:val="Heading1"/>
-        <w:spacing w:after="24" w:line="245" w:lineRule="auto"/>
+        <w:spacing w:after="16" w:before="0" w:line="240" w:lineRule="auto"/>
+        <w:ind w:left="227"/>
       </w:pPr>
       <w:r>
         <w:rPr>
-          <w:rFonts w:ascii="PingFang SC" w:hAnsi="PingFang SC" w:eastAsia="PingFang SC"/>
+          <w:b w:val="0"/>
+          <w:color w:val="222222"/>
+          <w:sz w:val="18"/>
         </w:rPr>
-        <w:t>③ MVP 样例（可运行 Demo）</w:t>
+        <w:t xml:space="preserve">• </w:t>
+      </w:r>
+      <w:r>
+        <w:rPr>
+          <w:b/>
+          <w:color w:val="222222"/>
+          <w:sz w:val="18"/>
+        </w:rPr>
+        <w:t>市场盘</w:t>
+      </w:r>
+      <w:r>
+        <w:rPr>
+          <w:b w:val="0"/>
+          <w:color w:val="222222"/>
+          <w:sz w:val="18"/>
+        </w:rPr>
+        <w:t xml:space="preserve">：央视网《2026 中国宠物行业白皮书》报道——2025 城镇犬猫消费 </w:t>
+      </w:r>
+      <w:r>
+        <w:rPr>
+          <w:b/>
+          <w:color w:val="222222"/>
+          <w:sz w:val="18"/>
+        </w:rPr>
+        <w:t>3126 亿</w:t>
+      </w:r>
+      <w:r>
+        <w:rPr>
+          <w:b w:val="0"/>
+          <w:color w:val="222222"/>
+          <w:sz w:val="18"/>
+        </w:rPr>
+        <w:t xml:space="preserve">，单犬年均 </w:t>
+      </w:r>
+      <w:r>
+        <w:rPr>
+          <w:b/>
+          <w:color w:val="222222"/>
+          <w:sz w:val="18"/>
+        </w:rPr>
+        <w:t>¥3006</w:t>
+      </w:r>
+      <w:r>
+        <w:rPr>
+          <w:b w:val="0"/>
+          <w:color w:val="222222"/>
+          <w:sz w:val="18"/>
+        </w:rPr>
+        <w:t xml:space="preserve">，食品 / 医疗 / 用品 / 服务 = 53.7% / 27.6% / 12.2% / </w:t>
+      </w:r>
+      <w:r>
+        <w:rPr>
+          <w:b/>
+          <w:color w:val="222222"/>
+          <w:sz w:val="18"/>
+        </w:rPr>
+        <w:t>6.5%</w:t>
+      </w:r>
+      <w:r>
+        <w:rPr>
+          <w:b w:val="0"/>
+          <w:color w:val="222222"/>
+          <w:sz w:val="18"/>
+        </w:rPr>
+        <w:t>。</w:t>
       </w:r>
     </w:p>
     <w:p>
       <w:pPr>
-        <w:spacing w:after="14"/>
-        <w:ind w:left="125" w:hanging="79"/>
+        <w:spacing w:after="16" w:before="0" w:line="240" w:lineRule="auto"/>
+        <w:ind w:left="227"/>
       </w:pPr>
       <w:r>
         <w:rPr>
-          <w:rFonts w:ascii="PingFang SC" w:hAnsi="PingFang SC" w:eastAsia="PingFang SC"/>
-          <w:sz w:val="14"/>
+          <w:b w:val="0"/>
+          <w:color w:val="666666"/>
+          <w:sz w:val="18"/>
         </w:rPr>
-        <w:t>• 三段式工作流：Stage1 结构化口语描述 -&gt; Stage2 行为根因诊断/严重度/医疗边界 -&gt; Stage3 生成 4-8 周训练计划、每日任务、成功标准、道具和安全红线。</w:t>
+        <w:t xml:space="preserve">• </w:t>
+      </w:r>
+      <w:r>
+        <w:rPr>
+          <w:b/>
+          <w:color w:val="666666"/>
+          <w:sz w:val="18"/>
+        </w:rPr>
+        <w:t>证据强度自陈</w:t>
+      </w:r>
+      <w:r>
+        <w:rPr>
+          <w:b w:val="0"/>
+          <w:color w:val="666666"/>
+          <w:sz w:val="18"/>
+        </w:rPr>
+        <w:t>：以上为公开网络资料 / 桌面调研 + 社群观察，</w:t>
+      </w:r>
+      <w:r>
+        <w:rPr>
+          <w:b/>
+          <w:color w:val="666666"/>
+          <w:sz w:val="18"/>
+        </w:rPr>
+        <w:t>尚未做一手访谈或问卷</w:t>
+      </w:r>
+      <w:r>
+        <w:rPr>
+          <w:b w:val="0"/>
+          <w:color w:val="666666"/>
+          <w:sz w:val="18"/>
+        </w:rPr>
+        <w:t>；“3–7 天放弃”是我从求助帖归纳的待验证假设，不是实测数据，已列为 ⑤ 第一步的校准目标。</w:t>
       </w:r>
     </w:p>
     <w:p>
       <w:pPr>
-        <w:spacing w:after="14"/>
-        <w:ind w:left="125" w:hanging="79"/>
+        <w:spacing w:after="24" w:before="60" w:line="240" w:lineRule="auto"/>
       </w:pPr>
       <w:r>
         <w:rPr>
-          <w:rFonts w:ascii="PingFang SC" w:hAnsi="PingFang SC" w:eastAsia="PingFang SC"/>
-          <w:sz w:val="14"/>
+          <w:b/>
+          <w:color w:val="2F5B4C"/>
+          <w:sz w:val="20"/>
         </w:rPr>
-        <w:t>• 已完成：文本模型主线、mock/live 双模式、Zod 结构校验兜底、诊断卡、6 周计划、本地打卡、localStorage、基于完成率的规则化次日提示。</w:t>
+        <w:t>③ MVP 样例（可运行 Demo，非原型图）</w:t>
       </w:r>
     </w:p>
     <w:p>
       <w:pPr>
-        <w:spacing w:after="14"/>
-        <w:ind w:left="125" w:hanging="79"/>
+        <w:spacing w:after="16" w:before="0" w:line="240" w:lineRule="auto"/>
+        <w:ind w:left="227"/>
       </w:pPr>
       <w:r>
         <w:rPr>
-          <w:rFonts w:ascii="PingFang SC" w:hAnsi="PingFang SC" w:eastAsia="PingFang SC"/>
-          <w:sz w:val="14"/>
+          <w:b w:val="0"/>
+          <w:color w:val="222222"/>
+          <w:sz w:val="18"/>
         </w:rPr>
-        <w:t>• 诚实边界：当前“次日提示”是前端规则演示，不是 AI 视频反馈闭环；deepseek-chat 不读取图片/视频。</w:t>
+        <w:t xml:space="preserve">• </w:t>
+      </w:r>
+      <w:r>
+        <w:rPr>
+          <w:b/>
+          <w:color w:val="222222"/>
+          <w:sz w:val="18"/>
+        </w:rPr>
+        <w:t>三段式 AI 工作流（核心资产）</w:t>
+      </w:r>
+      <w:r>
+        <w:rPr>
+          <w:b w:val="0"/>
+          <w:color w:val="222222"/>
+          <w:sz w:val="18"/>
+        </w:rPr>
+        <w:t>：Stage1 把零散口语</w:t>
+      </w:r>
+      <w:r>
+        <w:rPr>
+          <w:b/>
+          <w:color w:val="222222"/>
+          <w:sz w:val="18"/>
+        </w:rPr>
+        <w:t>结构化</w:t>
+      </w:r>
+      <w:r>
+        <w:rPr>
+          <w:b w:val="0"/>
+          <w:color w:val="222222"/>
+          <w:sz w:val="18"/>
+        </w:rPr>
+        <w:t>成宠物画像；Stage2 输出</w:t>
+      </w:r>
+      <w:r>
+        <w:rPr>
+          <w:b/>
+          <w:color w:val="222222"/>
+          <w:sz w:val="18"/>
+        </w:rPr>
+        <w:t>行为根因诊断 + 严重度分级(low/medium/high) + 医疗边界</w:t>
+      </w:r>
+      <w:r>
+        <w:rPr>
+          <w:b w:val="0"/>
+          <w:color w:val="222222"/>
+          <w:sz w:val="18"/>
+        </w:rPr>
+        <w:t xml:space="preserve">（疑似疾病即建议就医）；Stage3 生成 </w:t>
+      </w:r>
+      <w:r>
+        <w:rPr>
+          <w:b/>
+          <w:color w:val="222222"/>
+          <w:sz w:val="18"/>
+        </w:rPr>
+        <w:t>4–8 周训练计划</w:t>
+      </w:r>
+      <w:r>
+        <w:rPr>
+          <w:b w:val="0"/>
+          <w:color w:val="222222"/>
+          <w:sz w:val="18"/>
+        </w:rPr>
+        <w:t>（每周目标、每日任务“做什么 / 多久 / 成功标准”、所需道具、安全红线）。三段 Prompt 均强约束只输出 JSON，前端稳定渲染。</w:t>
       </w:r>
     </w:p>
     <w:p>
       <w:pPr>
-        <w:pStyle w:val="Heading1"/>
-        <w:spacing w:after="24" w:line="245" w:lineRule="auto"/>
+        <w:spacing w:after="16" w:before="0" w:line="240" w:lineRule="auto"/>
+        <w:ind w:left="227"/>
       </w:pPr>
       <w:r>
         <w:rPr>
-          <w:rFonts w:ascii="PingFang SC" w:hAnsi="PingFang SC" w:eastAsia="PingFang SC"/>
+          <w:b w:val="0"/>
+          <w:color w:val="222222"/>
+          <w:sz w:val="18"/>
+        </w:rPr>
+        <w:t xml:space="preserve">• </w:t>
+      </w:r>
+      <w:r>
+        <w:rPr>
+          <w:b/>
+          <w:color w:val="222222"/>
+          <w:sz w:val="18"/>
+        </w:rPr>
+        <w:t>技术栈</w:t>
+      </w:r>
+      <w:r>
+        <w:rPr>
+          <w:b w:val="0"/>
+          <w:color w:val="222222"/>
+          <w:sz w:val="18"/>
+        </w:rPr>
+        <w:t>：Next.js(App Router) + TypeScript + Tailwind；`/api/coach` 串行编排三段；DeepSeek live / 确定性 mock 双模式；Zod 输入校验 + live 输出结构兜底（异常回退 mock）；Vitest 测试覆盖。</w:t>
+      </w:r>
+    </w:p>
+    <w:p>
+      <w:pPr>
+        <w:spacing w:after="16" w:before="0" w:line="240" w:lineRule="auto"/>
+        <w:ind w:left="227"/>
+      </w:pPr>
+      <w:r>
+        <w:rPr>
+          <w:b w:val="0"/>
+          <w:color w:val="222222"/>
+          <w:sz w:val="18"/>
+        </w:rPr>
+        <w:t xml:space="preserve">• </w:t>
+      </w:r>
+      <w:r>
+        <w:rPr>
+          <w:b/>
+          <w:color w:val="222222"/>
+          <w:sz w:val="18"/>
+        </w:rPr>
+        <w:t>已完成</w:t>
+      </w:r>
+      <w:r>
+        <w:rPr>
+          <w:b w:val="0"/>
+          <w:color w:val="222222"/>
+          <w:sz w:val="18"/>
+        </w:rPr>
+        <w:t>：结果页（诊断卡 / 严重度刻度 / 6 周计划手风琴 / 安全红线 / 一次性免责声明）、本地打卡进度、localStorage 持久化、基于完成率的规则化次日提示（最小陪跑闭环）。</w:t>
+      </w:r>
+    </w:p>
+    <w:p>
+      <w:pPr>
+        <w:spacing w:after="16" w:before="0" w:line="240" w:lineRule="auto"/>
+        <w:ind w:left="227"/>
+      </w:pPr>
+      <w:r>
+        <w:rPr>
+          <w:b w:val="0"/>
+          <w:color w:val="666666"/>
+          <w:sz w:val="18"/>
+        </w:rPr>
+        <w:t xml:space="preserve">• </w:t>
+      </w:r>
+      <w:r>
+        <w:rPr>
+          <w:b/>
+          <w:color w:val="666666"/>
+          <w:sz w:val="18"/>
+        </w:rPr>
+        <w:t>诚实边界</w:t>
+      </w:r>
+      <w:r>
+        <w:rPr>
+          <w:b w:val="0"/>
+          <w:color w:val="666666"/>
+          <w:sz w:val="18"/>
+        </w:rPr>
+        <w:t>：当前“次日提示”是前端规则演示，</w:t>
+      </w:r>
+      <w:r>
+        <w:rPr>
+          <w:b/>
+          <w:color w:val="666666"/>
+          <w:sz w:val="18"/>
+        </w:rPr>
+        <w:t>不是 AI 回传微调</w:t>
+      </w:r>
+      <w:r>
+        <w:rPr>
+          <w:b w:val="0"/>
+          <w:color w:val="666666"/>
+          <w:sz w:val="18"/>
+        </w:rPr>
+        <w:t>；deepseek-chat 不读取图片 / 视频——这两块（AI 微调 + 视频理解）是下一步、也是真正的护城河。</w:t>
+      </w:r>
+    </w:p>
+    <w:p>
+      <w:pPr>
+        <w:spacing w:after="24" w:before="60" w:line="240" w:lineRule="auto"/>
+      </w:pPr>
+      <w:r>
+        <w:rPr>
+          <w:b/>
+          <w:color w:val="2F5B4C"/>
+          <w:sz w:val="20"/>
         </w:rPr>
         <w:t>④ 商业判断</w:t>
       </w:r>
     </w:p>
     <w:p>
       <w:pPr>
-        <w:spacing w:after="14"/>
-        <w:ind w:left="125" w:hanging="79"/>
+        <w:spacing w:after="16" w:before="0" w:line="240" w:lineRule="auto"/>
+        <w:ind w:left="227"/>
       </w:pPr>
       <w:r>
         <w:rPr>
-          <w:rFonts w:ascii="PingFang SC" w:hAnsi="PingFang SC" w:eastAsia="PingFang SC"/>
-          <w:sz w:val="14"/>
+          <w:b w:val="0"/>
+          <w:color w:val="222222"/>
+          <w:sz w:val="18"/>
         </w:rPr>
-        <w:t>• 谁付费：愿为狗花钱（2025 单只犬年均消费 3006 元）、习惯线上服务、被线下“贵且不确定”劝退的新手养狗人。</w:t>
+        <w:t xml:space="preserve">• </w:t>
+      </w:r>
+      <w:r>
+        <w:rPr>
+          <w:b/>
+          <w:color w:val="222222"/>
+          <w:sz w:val="18"/>
+        </w:rPr>
+        <w:t>谁付费</w:t>
+      </w:r>
+      <w:r>
+        <w:rPr>
+          <w:b w:val="0"/>
+          <w:color w:val="222222"/>
+          <w:sz w:val="18"/>
+        </w:rPr>
+        <w:t>：愿为狗花钱（单犬年均 ¥3006）、习惯线上订阅、被线下“贵且反弹”劝退的新手养狗人。</w:t>
       </w:r>
     </w:p>
     <w:p>
       <w:pPr>
-        <w:spacing w:after="14"/>
-        <w:ind w:left="125" w:hanging="79"/>
+        <w:spacing w:after="16" w:before="0" w:line="240" w:lineRule="auto"/>
+        <w:ind w:left="227"/>
       </w:pPr>
       <w:r>
         <w:rPr>
-          <w:rFonts w:ascii="PingFang SC" w:hAnsi="PingFang SC" w:eastAsia="PingFang SC"/>
-          <w:sz w:val="14"/>
+          <w:b w:val="0"/>
+          <w:color w:val="222222"/>
+          <w:sz w:val="18"/>
         </w:rPr>
-        <w:t>• 为什么付费：买的不是知识，而是坚持执行 + 持续反馈；99 元六周训练营相对线下 1000+ 足够低，后续可叠加围栏/漏食球/零食 CPS。</w:t>
+        <w:t xml:space="preserve">• </w:t>
+      </w:r>
+      <w:r>
+        <w:rPr>
+          <w:b/>
+          <w:color w:val="222222"/>
+          <w:sz w:val="18"/>
+        </w:rPr>
+        <w:t>为什么付费</w:t>
+      </w:r>
+      <w:r>
+        <w:rPr>
+          <w:b w:val="0"/>
+          <w:color w:val="222222"/>
+          <w:sz w:val="18"/>
+        </w:rPr>
+        <w:t>：买的不是知识（免费遍地），是“</w:t>
+      </w:r>
+      <w:r>
+        <w:rPr>
+          <w:b/>
+          <w:color w:val="222222"/>
+          <w:sz w:val="18"/>
+        </w:rPr>
+        <w:t>坚持执行 + 持续反馈 + 真见效</w:t>
+      </w:r>
+      <w:r>
+        <w:rPr>
+          <w:b w:val="0"/>
+          <w:color w:val="222222"/>
+          <w:sz w:val="18"/>
+        </w:rPr>
+        <w:t>”——比线下便宜约 10 倍、可迁移到主人、全程透明正向强化。</w:t>
       </w:r>
     </w:p>
     <w:p>
       <w:pPr>
-        <w:spacing w:after="14"/>
-        <w:ind w:left="125" w:hanging="79"/>
+        <w:spacing w:after="16" w:before="0" w:line="240" w:lineRule="auto"/>
+        <w:ind w:left="227"/>
       </w:pPr>
       <w:r>
         <w:rPr>
-          <w:rFonts w:ascii="PingFang SC" w:hAnsi="PingFang SC" w:eastAsia="PingFang SC"/>
-          <w:sz w:val="14"/>
+          <w:b w:val="0"/>
+          <w:color w:val="222222"/>
+          <w:sz w:val="18"/>
         </w:rPr>
-        <w:t>• 诚实标注：付费意愿目前只有间接证据；真实付费要用 waitlist 和假付费按钮实测，before-after 传播不能在验证前当作已成立。</w:t>
+        <w:t xml:space="preserve">• </w:t>
+      </w:r>
+      <w:r>
+        <w:rPr>
+          <w:b/>
+          <w:color w:val="222222"/>
+          <w:sz w:val="18"/>
+        </w:rPr>
+        <w:t>定价</w:t>
+      </w:r>
+      <w:r>
+        <w:rPr>
+          <w:b w:val="0"/>
+          <w:color w:val="222222"/>
+          <w:sz w:val="18"/>
+        </w:rPr>
+        <w:t>：免费诊断 + 周计划做</w:t>
+      </w:r>
+      <w:r>
+        <w:rPr>
+          <w:b/>
+          <w:color w:val="222222"/>
+          <w:sz w:val="18"/>
+        </w:rPr>
+        <w:t>获客钩子</w:t>
+      </w:r>
+      <w:r>
+        <w:rPr>
+          <w:b w:val="0"/>
+          <w:color w:val="222222"/>
+          <w:sz w:val="18"/>
+        </w:rPr>
+        <w:t xml:space="preserve"> → </w:t>
+      </w:r>
+      <w:r>
+        <w:rPr>
+          <w:b/>
+          <w:color w:val="222222"/>
+          <w:sz w:val="18"/>
+        </w:rPr>
+        <w:t>¥99「6 周训练营」一次性</w:t>
+      </w:r>
+      <w:r>
+        <w:rPr>
+          <w:b w:val="0"/>
+          <w:color w:val="222222"/>
+          <w:sz w:val="18"/>
+        </w:rPr>
+        <w:t xml:space="preserve">（锚定线下 ¥1000+，一次性买断降低“中途没坚持就退订”的流失，转化优于月订阅） → 训练中推荐围栏 / 漏食球 / 嗅闻垫 / 零食，赚 </w:t>
+      </w:r>
+      <w:r>
+        <w:rPr>
+          <w:b/>
+          <w:color w:val="222222"/>
+          <w:sz w:val="18"/>
+        </w:rPr>
+        <w:t>CPS 导购佣金</w:t>
+      </w:r>
+      <w:r>
+        <w:rPr>
+          <w:b w:val="0"/>
+          <w:color w:val="222222"/>
+          <w:sz w:val="18"/>
+        </w:rPr>
+        <w:t>。</w:t>
       </w:r>
     </w:p>
     <w:p>
       <w:pPr>
-        <w:pStyle w:val="Heading1"/>
-        <w:spacing w:after="24" w:line="245" w:lineRule="auto"/>
+        <w:spacing w:after="16" w:before="0" w:line="240" w:lineRule="auto"/>
+        <w:ind w:left="227"/>
       </w:pPr>
       <w:r>
         <w:rPr>
-          <w:rFonts w:ascii="PingFang SC" w:hAnsi="PingFang SC" w:eastAsia="PingFang SC"/>
+          <w:b w:val="0"/>
+          <w:color w:val="222222"/>
+          <w:sz w:val="18"/>
         </w:rPr>
-        <w:t>⑤ 2 周验证计划（go/no-go）</w:t>
+        <w:t xml:space="preserve">• </w:t>
+      </w:r>
+      <w:r>
+        <w:rPr>
+          <w:b/>
+          <w:color w:val="222222"/>
+          <w:sz w:val="18"/>
+        </w:rPr>
+        <w:t>获客</w:t>
+      </w:r>
+      <w:r>
+        <w:rPr>
+          <w:b w:val="0"/>
+          <w:color w:val="222222"/>
+          <w:sz w:val="18"/>
+        </w:rPr>
+        <w:t>：小红书 / 抖音 before-after 打卡视频（天然可传播）、狗主社群裂变、宠粮 / 用品 KOL 合作、长尾 SEO（“XX 犬拆家怎么办”）。</w:t>
+      </w:r>
+      <w:r>
+        <w:rPr>
+          <w:b/>
+          <w:color w:val="222222"/>
+          <w:sz w:val="18"/>
+        </w:rPr>
+        <w:t>诚实标注</w:t>
+      </w:r>
+      <w:r>
+        <w:rPr>
+          <w:b w:val="0"/>
+          <w:color w:val="222222"/>
+          <w:sz w:val="18"/>
+        </w:rPr>
+        <w:t>：付费意愿目前仅间接证据，真实转化用 waitlist + 假付费按钮实测；before-after 依赖真实见效，不在验证前当作已成立。</w:t>
       </w:r>
     </w:p>
     <w:p>
       <w:pPr>
-        <w:spacing w:after="14"/>
-        <w:ind w:left="125" w:hanging="79"/>
+        <w:spacing w:after="24" w:before="60" w:line="240" w:lineRule="auto"/>
       </w:pPr>
       <w:r>
         <w:rPr>
-          <w:rFonts w:ascii="PingFang SC" w:hAnsi="PingFang SC" w:eastAsia="PingFang SC"/>
-          <w:sz w:val="14"/>
+          <w:b/>
+          <w:color w:val="2F5B4C"/>
+          <w:sz w:val="20"/>
         </w:rPr>
-        <w:t>• Week 1：深访 10 位新手狗主 + Landing Page + 200-500 元投放；成功阈值：留资率 &gt;=10%，且 &gt;=6/10 能说出明确放弃时点或卡住原因。</w:t>
+        <w:t>⑤ 2 周验证计划（每步：验证什么 + 资源 + go / no-go）</w:t>
       </w:r>
     </w:p>
     <w:p>
       <w:pPr>
-        <w:spacing w:after="14"/>
-        <w:ind w:left="125" w:hanging="79"/>
+        <w:spacing w:after="16" w:before="0" w:line="240" w:lineRule="auto"/>
+        <w:ind w:left="227"/>
       </w:pPr>
       <w:r>
         <w:rPr>
-          <w:rFonts w:ascii="PingFang SC" w:hAnsi="PingFang SC" w:eastAsia="PingFang SC"/>
-          <w:sz w:val="14"/>
+          <w:b w:val="0"/>
+          <w:color w:val="222222"/>
+          <w:sz w:val="18"/>
         </w:rPr>
-        <w:t>• Week 2：10 人真实试用 14 天；核心指标 D7/D14 留存、每日打卡完成率、连续 3 天完成占比、假付费点击转化。go/no-go：D14 留存 &gt;=40% 且连续 3 天打卡完成率 &gt;=50% 且假付费点击转化 &gt;=15% -&gt; 继续，否则回炉。n=10 只取定性信号。</w:t>
+        <w:t xml:space="preserve">• </w:t>
+      </w:r>
+      <w:r>
+        <w:rPr>
+          <w:b/>
+          <w:color w:val="222222"/>
+          <w:sz w:val="18"/>
+        </w:rPr>
+        <w:t>Week 1 · 需求验证（尚未开始，为计划）</w:t>
+      </w:r>
+      <w:r>
+        <w:rPr>
+          <w:b w:val="0"/>
+          <w:color w:val="222222"/>
+          <w:sz w:val="18"/>
+        </w:rPr>
+        <w:t xml:space="preserve">：深访 </w:t>
+      </w:r>
+      <w:r>
+        <w:rPr>
+          <w:b/>
+          <w:color w:val="222222"/>
+          <w:sz w:val="18"/>
+        </w:rPr>
+        <w:t>10 位</w:t>
+      </w:r>
+      <w:r>
+        <w:rPr>
+          <w:b w:val="0"/>
+          <w:color w:val="222222"/>
+          <w:sz w:val="18"/>
+        </w:rPr>
+        <w:t xml:space="preserve">新手狗主（小红书私信 / 社群 / 问卷星），校准“放弃时点”与付费意愿；上线 Landing Page，投 </w:t>
+      </w:r>
+      <w:r>
+        <w:rPr>
+          <w:b/>
+          <w:color w:val="222222"/>
+          <w:sz w:val="18"/>
+        </w:rPr>
+        <w:t>¥200–500</w:t>
+      </w:r>
+      <w:r>
+        <w:rPr>
+          <w:b w:val="0"/>
+          <w:color w:val="222222"/>
+          <w:sz w:val="18"/>
+        </w:rPr>
+        <w:t xml:space="preserve"> 测“点击 → 留资”。</w:t>
+      </w:r>
+      <w:r>
+        <w:rPr>
+          <w:b/>
+          <w:color w:val="222222"/>
+          <w:sz w:val="18"/>
+        </w:rPr>
+        <w:t>阈值</w:t>
+      </w:r>
+      <w:r>
+        <w:rPr>
+          <w:b w:val="0"/>
+          <w:color w:val="222222"/>
+          <w:sz w:val="18"/>
+        </w:rPr>
+        <w:t>：留资率 ≥ 10%；≥ 6/10 能说出明确放弃时点或卡住原因。</w:t>
       </w:r>
     </w:p>
     <w:p>
       <w:pPr>
-        <w:spacing w:before="20" w:after="0"/>
+        <w:spacing w:after="16" w:before="0" w:line="240" w:lineRule="auto"/>
+        <w:ind w:left="227"/>
       </w:pPr>
       <w:r>
         <w:rPr>
-          <w:rFonts w:ascii="PingFang SC" w:hAnsi="PingFang SC" w:eastAsia="PingFang SC"/>
+          <w:b w:val="0"/>
+          <w:color w:val="222222"/>
+          <w:sz w:val="18"/>
+        </w:rPr>
+        <w:t xml:space="preserve">• </w:t>
+      </w:r>
+      <w:r>
+        <w:rPr>
           <w:b/>
-          <w:sz w:val="14"/>
+          <w:color w:val="222222"/>
+          <w:sz w:val="18"/>
+        </w:rPr>
+        <w:t>Week 2 · 产品验证</w:t>
+      </w:r>
+      <w:r>
+        <w:rPr>
+          <w:b w:val="0"/>
+          <w:color w:val="222222"/>
+          <w:sz w:val="18"/>
+        </w:rPr>
+        <w:t xml:space="preserve">：邀 </w:t>
+      </w:r>
+      <w:r>
+        <w:rPr>
+          <w:b/>
+          <w:color w:val="222222"/>
+          <w:sz w:val="18"/>
+        </w:rPr>
+        <w:t>10 人真实试用 14 天</w:t>
+      </w:r>
+      <w:r>
+        <w:rPr>
+          <w:b w:val="0"/>
+          <w:color w:val="222222"/>
+          <w:sz w:val="18"/>
+        </w:rPr>
+        <w:t xml:space="preserve">（窗口按“见效需数周”设 14 天，不是 7 天）。核心指标 = </w:t>
+      </w:r>
+      <w:r>
+        <w:rPr>
+          <w:b/>
+          <w:color w:val="222222"/>
+          <w:sz w:val="18"/>
+        </w:rPr>
+        <w:t>D7/D14 留存 + 每日打卡完成率 + 连续 3 天完成占比 + 假付费点击转化 + NPS</w:t>
+      </w:r>
+      <w:r>
+        <w:rPr>
+          <w:b w:val="0"/>
+          <w:color w:val="222222"/>
+          <w:sz w:val="18"/>
+        </w:rPr>
+        <w:t>。</w:t>
+      </w:r>
+      <w:r>
+        <w:rPr>
+          <w:b/>
+          <w:color w:val="222222"/>
+          <w:sz w:val="18"/>
+        </w:rPr>
+        <w:t>go/no-go</w:t>
+      </w:r>
+      <w:r>
+        <w:rPr>
+          <w:b w:val="0"/>
+          <w:color w:val="222222"/>
+          <w:sz w:val="18"/>
+        </w:rPr>
+        <w:t>：D14 留存 ≥ 40% 且连续 3 天完成率 ≥ 50% 且假付费转化 ≥ 15% → 继续；否则回炉重想陪跑机制。n=10 只取定性信号与方向，不做统计结论。</w:t>
+      </w:r>
+    </w:p>
+    <w:p>
+      <w:pPr>
+        <w:spacing w:after="16" w:before="0" w:line="240" w:lineRule="auto"/>
+        <w:ind w:left="227"/>
+      </w:pPr>
+      <w:r>
+        <w:rPr>
+          <w:b w:val="0"/>
+          <w:color w:val="222222"/>
+          <w:sz w:val="18"/>
+        </w:rPr>
+        <w:t xml:space="preserve">• </w:t>
+      </w:r>
+      <w:r>
+        <w:rPr>
+          <w:b/>
+          <w:color w:val="222222"/>
+          <w:sz w:val="18"/>
+        </w:rPr>
+        <w:t>资源投入</w:t>
+      </w:r>
+      <w:r>
+        <w:rPr>
+          <w:b w:val="0"/>
+          <w:color w:val="222222"/>
+          <w:sz w:val="18"/>
+        </w:rPr>
+        <w:t>：个人时间 4–6h/天、AI API 约 ¥数百、Vercel 免费部署、¥200–500 投放、剪辑 / 问卷工具。</w:t>
+      </w:r>
+      <w:r>
+        <w:rPr>
+          <w:b/>
+          <w:color w:val="222222"/>
+          <w:sz w:val="18"/>
+        </w:rPr>
+        <w:t>无需大预算</w:t>
+      </w:r>
+      <w:r>
+        <w:rPr>
+          <w:b w:val="0"/>
+          <w:color w:val="222222"/>
+          <w:sz w:val="18"/>
+        </w:rPr>
+        <w:t>。</w:t>
+      </w:r>
+    </w:p>
+    <w:p>
+      <w:pPr>
+        <w:spacing w:before="80" w:after="0"/>
+      </w:pPr>
+      <w:r>
+        <w:rPr>
+          <w:b/>
+          <w:color w:val="222222"/>
+          <w:sz w:val="18"/>
         </w:rPr>
         <w:t>在线 Demo：</w:t>
       </w:r>
       <w:hyperlink r:id="rId9">
         <w:r>
           <w:rPr>
-            <w:color w:val="0563C1"/>
+            <w:color w:val="1A5FB4"/>
             <w:u w:val="single"/>
+            <w:sz w:val="19"/>
           </w:rPr>
-          <w:t>https://pet-coach-mvp.vercel.app/</w:t>
+          <w:t>pet-coach-mvp.vercel.app</w:t>
         </w:r>
       </w:hyperlink>
       <w:r>
         <w:rPr>
-          <w:rFonts w:ascii="PingFang SC" w:hAnsi="PingFang SC" w:eastAsia="PingFang SC"/>
           <w:b/>
-          <w:sz w:val="14"/>
+          <w:color w:val="222222"/>
+          <w:sz w:val="18"/>
         </w:rPr>
-        <w:t xml:space="preserve"> ｜ 代码仓库：</w:t>
+        <w:t xml:space="preserve">　｜　代码仓库：</w:t>
       </w:r>
       <w:hyperlink r:id="rId10">
         <w:r>
           <w:rPr>
-            <w:color w:val="0563C1"/>
+            <w:color w:val="1A5FB4"/>
             <w:u w:val="single"/>
+            <w:sz w:val="19"/>
           </w:rPr>
           <w:t>github.com/bbainthug/pet-coach-mvp</w:t>
         </w:r>
       </w:hyperlink>
       <w:r>
         <w:rPr>
-          <w:rFonts w:ascii="PingFang SC" w:hAnsi="PingFang SC" w:eastAsia="PingFang SC"/>
-          <w:sz w:val="14"/>
+          <w:color w:val="666666"/>
+          <w:sz w:val="17"/>
         </w:rPr>
-        <w:t xml:space="preserve"> ｜ 本产品定位行为训练辅助，不替代兽医诊疗。</w:t>
+        <w:t xml:space="preserve">　｜　本产品定位行为训练辅助，不替代兽医诊疗。</w:t>
       </w:r>
     </w:p>
     <w:sectPr>
       <w:pgSz w:w="11906" w:h="16838"/>
-      <w:pgMar w:top="425" w:right="482" w:bottom="425" w:left="482" w:header="720" w:footer="720" w:gutter="0"/>
+      <w:pgMar w:top="567" w:right="567" w:bottom="567" w:left="567" w:header="720" w:footer="720" w:gutter="0"/>
       <w:cols w:space="720"/>
       <w:docGrid w:linePitch="360"/>
     </w:sectPr>
@@ -688,12 +1660,9 @@
     <w:name w:val="Normal"/>
     <w:qFormat/>
     <w:rsid w:val="00FC693F"/>
-    <w:pPr>
-      <w:spacing w:after="24" w:line="245" w:lineRule="auto"/>
-    </w:pPr>
     <w:rPr>
-      <w:rFonts w:ascii="PingFang SC" w:hAnsi="PingFang SC" w:eastAsia="PingFang SC"/>
-      <w:sz w:val="14"/>
+      <w:rFonts w:ascii="Microsoft YaHei" w:hAnsi="Microsoft YaHei" w:eastAsia="微软雅黑"/>
+      <w:sz w:val="18"/>
     </w:rPr>
   </w:style>
   <w:style w:type="paragraph" w:styleId="Header">
@@ -751,15 +1720,15 @@
     <w:pPr>
       <w:keepNext/>
       <w:keepLines/>
-      <w:spacing w:before="0" w:after="40" w:line="240" w:lineRule="auto"/>
+      <w:spacing w:before="480" w:after="0"/>
       <w:outlineLvl w:val="0"/>
     </w:pPr>
     <w:rPr>
-      <w:rFonts w:asciiTheme="majorHAnsi" w:eastAsiaTheme="majorEastAsia" w:hAnsiTheme="majorHAnsi" w:cstheme="majorBidi" w:ascii="PingFang SC" w:hAnsi="PingFang SC" w:eastAsia="PingFang SC"/>
+      <w:rFonts w:asciiTheme="majorHAnsi" w:eastAsiaTheme="majorEastAsia" w:hAnsiTheme="majorHAnsi" w:cstheme="majorBidi"/>
       <w:b/>
       <w:bCs/>
       <w:color w:val="365F91" w:themeColor="accent1" w:themeShade="BF"/>
-      <w:sz w:val="17"/>
+      <w:sz w:val="28"/>
       <w:szCs w:val="28"/>
     </w:rPr>
   </w:style>
@@ -775,15 +1744,15 @@
     <w:pPr>
       <w:keepNext/>
       <w:keepLines/>
-      <w:spacing w:before="0" w:after="40" w:line="240" w:lineRule="auto"/>
+      <w:spacing w:before="200" w:after="0"/>
       <w:outlineLvl w:val="1"/>
     </w:pPr>
     <w:rPr>
-      <w:rFonts w:asciiTheme="majorHAnsi" w:eastAsiaTheme="majorEastAsia" w:hAnsiTheme="majorHAnsi" w:cstheme="majorBidi" w:ascii="PingFang SC" w:hAnsi="PingFang SC" w:eastAsia="PingFang SC"/>
+      <w:rFonts w:asciiTheme="majorHAnsi" w:eastAsiaTheme="majorEastAsia" w:hAnsiTheme="majorHAnsi" w:cstheme="majorBidi"/>
       <w:b/>
       <w:bCs/>
       <w:color w:val="4F81BD" w:themeColor="accent1"/>
-      <w:sz w:val="16"/>
+      <w:sz w:val="26"/>
       <w:szCs w:val="26"/>
     </w:rPr>
   </w:style>
@@ -1040,16 +2009,15 @@
       <w:pBdr>
         <w:bottom w:val="single" w:sz="8" w:space="4" w:color="4F81BD" w:themeColor="accent1"/>
       </w:pBdr>
-      <w:spacing w:after="40" w:line="240" w:lineRule="auto" w:before="0"/>
+      <w:spacing w:after="300" w:line="240" w:lineRule="auto"/>
       <w:contextualSpacing/>
     </w:pPr>
     <w:rPr>
-      <w:rFonts w:asciiTheme="majorHAnsi" w:eastAsiaTheme="majorEastAsia" w:hAnsiTheme="majorHAnsi" w:cstheme="majorBidi" w:ascii="PingFang SC" w:hAnsi="PingFang SC" w:eastAsia="PingFang SC"/>
-      <w:b/>
-      <w:color w:val="141414"/>
+      <w:rFonts w:asciiTheme="majorHAnsi" w:eastAsiaTheme="majorEastAsia" w:hAnsiTheme="majorHAnsi" w:cstheme="majorBidi"/>
+      <w:color w:val="17365D" w:themeColor="text2" w:themeShade="BF"/>
       <w:spacing w:val="5"/>
       <w:kern w:val="28"/>
-      <w:sz w:val="26"/>
+      <w:sz w:val="52"/>
       <w:szCs w:val="52"/>
     </w:rPr>
   </w:style>

</xml_diff>

<commit_message>
Tighten A4 document layout
</commit_message>
<xml_diff>
--- a/pet-coach-A4.docx
+++ b/pet-coach-A4.docx
@@ -25,7 +25,7 @@
         <w:rPr>
           <w:b w:val="0"/>
           <w:color w:val="666666"/>
-          <w:sz w:val="18"/>
+          <w:sz w:val="17"/>
         </w:rPr>
         <w:t>方向：宠物 AI　｜　一句话：免费训狗教程铺天盖地，但新手养狗人常在见效前就放弃。PetCoach 用 AI 把口语描述转成</w:t>
       </w:r>
@@ -33,7 +33,7 @@
         <w:rPr>
           <w:b/>
           <w:color w:val="666666"/>
-          <w:sz w:val="18"/>
+          <w:sz w:val="17"/>
         </w:rPr>
         <w:t>行为诊断 → 严重度分级 → 分周训练计划 → 每日任务</w:t>
       </w:r>
@@ -41,7 +41,7 @@
         <w:rPr>
           <w:b w:val="0"/>
           <w:color w:val="666666"/>
-          <w:sz w:val="18"/>
+          <w:sz w:val="17"/>
         </w:rPr>
         <w:t>，并以打卡 + 规则化次日提示演示“陪主人坚持”的最小闭环——</w:t>
       </w:r>
@@ -49,7 +49,7 @@
         <w:rPr>
           <w:b/>
           <w:color w:val="666666"/>
-          <w:sz w:val="18"/>
+          <w:sz w:val="17"/>
         </w:rPr>
         <w:t>我们卖的不是知识，是坚持到见效</w:t>
       </w:r>
@@ -57,7 +57,7 @@
         <w:rPr>
           <w:b w:val="0"/>
           <w:color w:val="666666"/>
-          <w:sz w:val="18"/>
+          <w:sz w:val="17"/>
         </w:rPr>
         <w:t>。</w:t>
       </w:r>
@@ -70,7 +70,7 @@
         <w:rPr>
           <w:b/>
           <w:color w:val="2F5B4C"/>
-          <w:sz w:val="20"/>
+          <w:sz w:val="19"/>
         </w:rPr>
         <w:t>① 机会判断</w:t>
       </w:r>
@@ -84,7 +84,7 @@
         <w:rPr>
           <w:b w:val="0"/>
           <w:color w:val="222222"/>
-          <w:sz w:val="18"/>
+          <w:sz w:val="17"/>
         </w:rPr>
         <w:t xml:space="preserve">• </w:t>
       </w:r>
@@ -92,7 +92,7 @@
         <w:rPr>
           <w:b/>
           <w:color w:val="222222"/>
-          <w:sz w:val="18"/>
+          <w:sz w:val="17"/>
         </w:rPr>
         <w:t>目标用户</w:t>
       </w:r>
@@ -100,7 +100,7 @@
         <w:rPr>
           <w:b w:val="0"/>
           <w:color w:val="222222"/>
-          <w:sz w:val="18"/>
+          <w:sz w:val="17"/>
         </w:rPr>
         <w:t xml:space="preserve">：一线 / 新一线城市 90、00 后新手养狗人（狗 0–3 岁），独居或上班族，被拆家、分离焦虑、随地大小便、乱吠、扑人咬人击穿。白皮书报道 90 后占宠主 </w:t>
       </w:r>
@@ -108,7 +108,7 @@
         <w:rPr>
           <w:b/>
           <w:color w:val="222222"/>
-          <w:sz w:val="18"/>
+          <w:sz w:val="17"/>
         </w:rPr>
         <w:t>42.7%</w:t>
       </w:r>
@@ -116,7 +116,7 @@
         <w:rPr>
           <w:b w:val="0"/>
           <w:color w:val="222222"/>
-          <w:sz w:val="18"/>
+          <w:sz w:val="17"/>
         </w:rPr>
         <w:t xml:space="preserve">、00 后 </w:t>
       </w:r>
@@ -124,7 +124,7 @@
         <w:rPr>
           <w:b/>
           <w:color w:val="222222"/>
-          <w:sz w:val="18"/>
+          <w:sz w:val="17"/>
         </w:rPr>
         <w:t>26.3%</w:t>
       </w:r>
@@ -132,7 +132,7 @@
         <w:rPr>
           <w:b w:val="0"/>
           <w:color w:val="222222"/>
-          <w:sz w:val="18"/>
+          <w:sz w:val="17"/>
         </w:rPr>
         <w:t>（增速最快）。</w:t>
       </w:r>
@@ -146,7 +146,7 @@
         <w:rPr>
           <w:b w:val="0"/>
           <w:color w:val="222222"/>
-          <w:sz w:val="18"/>
+          <w:sz w:val="17"/>
         </w:rPr>
         <w:t xml:space="preserve">• </w:t>
       </w:r>
@@ -154,7 +154,7 @@
         <w:rPr>
           <w:b/>
           <w:color w:val="222222"/>
-          <w:sz w:val="18"/>
+          <w:sz w:val="17"/>
         </w:rPr>
         <w:t>核心痛点</w:t>
       </w:r>
@@ -162,7 +162,7 @@
         <w:rPr>
           <w:b w:val="0"/>
           <w:color w:val="222222"/>
-          <w:sz w:val="18"/>
+          <w:sz w:val="17"/>
         </w:rPr>
         <w:t>：缺的不是方法，是</w:t>
       </w:r>
@@ -170,7 +170,7 @@
         <w:rPr>
           <w:b/>
           <w:color w:val="222222"/>
-          <w:sz w:val="18"/>
+          <w:sz w:val="17"/>
         </w:rPr>
         <w:t>坚持与反馈</w:t>
       </w:r>
@@ -178,7 +178,7 @@
         <w:rPr>
           <w:b w:val="0"/>
           <w:color w:val="222222"/>
-          <w:sz w:val="18"/>
+          <w:sz w:val="17"/>
         </w:rPr>
         <w:t>。训练见效常需</w:t>
       </w:r>
@@ -186,7 +186,7 @@
         <w:rPr>
           <w:b/>
           <w:color w:val="222222"/>
-          <w:sz w:val="18"/>
+          <w:sz w:val="17"/>
         </w:rPr>
         <w:t>数周至数月</w:t>
       </w:r>
@@ -194,7 +194,7 @@
         <w:rPr>
           <w:b w:val="0"/>
           <w:color w:val="222222"/>
-          <w:sz w:val="18"/>
+          <w:sz w:val="17"/>
         </w:rPr>
         <w:t xml:space="preserve">，用户却往往几天就放弃；线下代训 </w:t>
       </w:r>
@@ -202,7 +202,7 @@
         <w:rPr>
           <w:b/>
           <w:color w:val="222222"/>
-          <w:sz w:val="18"/>
+          <w:sz w:val="17"/>
         </w:rPr>
         <w:t>¥1000–5800/月甚至上万</w:t>
       </w:r>
@@ -210,7 +210,7 @@
         <w:rPr>
           <w:b w:val="0"/>
           <w:color w:val="222222"/>
-          <w:sz w:val="18"/>
+          <w:sz w:val="17"/>
         </w:rPr>
         <w:t>且“回家就反弹”；免费视频不个性化、无反馈、不纠错。</w:t>
       </w:r>
@@ -224,7 +224,7 @@
         <w:rPr>
           <w:b w:val="0"/>
           <w:color w:val="222222"/>
-          <w:sz w:val="18"/>
+          <w:sz w:val="17"/>
         </w:rPr>
         <w:t xml:space="preserve">• </w:t>
       </w:r>
@@ -232,7 +232,7 @@
         <w:rPr>
           <w:b/>
           <w:color w:val="222222"/>
-          <w:sz w:val="18"/>
+          <w:sz w:val="17"/>
         </w:rPr>
         <w:t>为什么现在</w:t>
       </w:r>
@@ -240,7 +240,7 @@
         <w:rPr>
           <w:b w:val="0"/>
           <w:color w:val="222222"/>
-          <w:sz w:val="18"/>
+          <w:sz w:val="17"/>
         </w:rPr>
         <w:t xml:space="preserve">：① 2025 城镇犬猫消费 </w:t>
       </w:r>
@@ -248,7 +248,7 @@
         <w:rPr>
           <w:b/>
           <w:color w:val="222222"/>
-          <w:sz w:val="18"/>
+          <w:sz w:val="17"/>
         </w:rPr>
         <w:t>3126 亿</w:t>
       </w:r>
@@ -256,7 +256,7 @@
         <w:rPr>
           <w:b w:val="0"/>
           <w:color w:val="222222"/>
-          <w:sz w:val="18"/>
+          <w:sz w:val="17"/>
         </w:rPr>
         <w:t xml:space="preserve">，服务占比仅 </w:t>
       </w:r>
@@ -264,7 +264,7 @@
         <w:rPr>
           <w:b/>
           <w:color w:val="222222"/>
-          <w:sz w:val="18"/>
+          <w:sz w:val="17"/>
         </w:rPr>
         <w:t>6.5%</w:t>
       </w:r>
@@ -272,7 +272,7 @@
         <w:rPr>
           <w:b w:val="0"/>
           <w:color w:val="222222"/>
-          <w:sz w:val="18"/>
+          <w:sz w:val="17"/>
         </w:rPr>
         <w:t>（医疗 27.6%），渗透率洼地；② 付费主力换成习惯 App/AI 订阅打卡的 90/00 后；③ 多模态 LLM 边际成本趋零，未来可“看视频给即时反馈”，是唯一能做高频微反馈的形态（当前先用文本模型跑通主线）；④ 线下“买证、粗暴训练、代训反弹”信任崩塌，透明正向强化成为现成卖点。</w:t>
       </w:r>
@@ -286,7 +286,7 @@
         <w:rPr>
           <w:b w:val="0"/>
           <w:color w:val="222222"/>
-          <w:sz w:val="18"/>
+          <w:sz w:val="17"/>
         </w:rPr>
         <w:t xml:space="preserve">• </w:t>
       </w:r>
@@ -294,7 +294,7 @@
         <w:rPr>
           <w:b/>
           <w:color w:val="222222"/>
-          <w:sz w:val="18"/>
+          <w:sz w:val="17"/>
         </w:rPr>
         <w:t>主动亮风险</w:t>
       </w:r>
@@ -302,7 +302,7 @@
         <w:rPr>
           <w:b w:val="0"/>
           <w:color w:val="222222"/>
-          <w:sz w:val="18"/>
+          <w:sz w:val="17"/>
         </w:rPr>
         <w:t>：打卡 / 习惯类 App 自身留存也差——用户凭什么对我的 App 坚持数周？“AI 能否真正提升坚持率”是本方向命门，必须用真实 D14 留存验证，而非靠 Demo 说服。</w:t>
       </w:r>
@@ -315,7 +315,7 @@
         <w:rPr>
           <w:b/>
           <w:color w:val="2F5B4C"/>
-          <w:sz w:val="20"/>
+          <w:sz w:val="19"/>
         </w:rPr>
         <w:t>② 用户证据（可核查链接 + 社群观察）</w:t>
       </w:r>
@@ -329,7 +329,7 @@
         <w:rPr>
           <w:b w:val="0"/>
           <w:color w:val="222222"/>
-          <w:sz w:val="18"/>
+          <w:sz w:val="17"/>
         </w:rPr>
         <w:t xml:space="preserve">• </w:t>
       </w:r>
@@ -337,7 +337,7 @@
         <w:rPr>
           <w:b/>
           <w:color w:val="222222"/>
-          <w:sz w:val="18"/>
+          <w:sz w:val="17"/>
         </w:rPr>
         <w:t>痛点高频（公开讨论）</w:t>
       </w:r>
@@ -345,7 +345,7 @@
         <w:rPr>
           <w:b w:val="0"/>
           <w:color w:val="222222"/>
-          <w:sz w:val="18"/>
+          <w:sz w:val="17"/>
         </w:rPr>
         <w:t xml:space="preserve">：知乎分离焦虑讨论反复出现“嚎叫、刨门、破坏、独处焦虑”求助（知乎问答 / 专栏）；权威科普将分离焦虑症状列为吠叫 / 嚎叫、啃咬抓门、踱步（Farmina）。分离焦虑占犬行为问题约 </w:t>
       </w:r>
@@ -353,7 +353,7 @@
         <w:rPr>
           <w:b/>
           <w:color w:val="222222"/>
-          <w:sz w:val="18"/>
+          <w:sz w:val="17"/>
         </w:rPr>
         <w:t>20–40%</w:t>
       </w:r>
@@ -361,7 +361,7 @@
         <w:rPr>
           <w:b w:val="0"/>
           <w:color w:val="222222"/>
-          <w:sz w:val="18"/>
+          <w:sz w:val="17"/>
         </w:rPr>
         <w:t>。</w:t>
       </w:r>
@@ -375,7 +375,7 @@
         <w:rPr>
           <w:b w:val="0"/>
           <w:color w:val="222222"/>
-          <w:sz w:val="18"/>
+          <w:sz w:val="17"/>
         </w:rPr>
         <w:t xml:space="preserve">• </w:t>
       </w:r>
@@ -383,7 +383,7 @@
         <w:rPr>
           <w:b/>
           <w:color w:val="222222"/>
-          <w:sz w:val="18"/>
+          <w:sz w:val="17"/>
         </w:rPr>
         <w:t>成熟付费市场</w:t>
       </w:r>
@@ -391,7 +391,7 @@
         <w:rPr>
           <w:b w:val="0"/>
           <w:color w:val="222222"/>
-          <w:sz w:val="18"/>
+          <w:sz w:val="17"/>
         </w:rPr>
         <w:t xml:space="preserve">：羊城晚报报道到府课 </w:t>
       </w:r>
@@ -399,7 +399,7 @@
         <w:rPr>
           <w:b/>
           <w:color w:val="222222"/>
-          <w:sz w:val="18"/>
+          <w:sz w:val="17"/>
         </w:rPr>
         <w:t>¥1000–3000/节</w:t>
       </w:r>
@@ -407,7 +407,7 @@
         <w:rPr>
           <w:b w:val="0"/>
           <w:color w:val="222222"/>
-          <w:sz w:val="18"/>
+          <w:sz w:val="17"/>
         </w:rPr>
         <w:t xml:space="preserve">；CBNData / 市值榜报道基础服从训练普遍 </w:t>
       </w:r>
@@ -415,7 +415,7 @@
         <w:rPr>
           <w:b/>
           <w:color w:val="222222"/>
-          <w:sz w:val="18"/>
+          <w:sz w:val="17"/>
         </w:rPr>
         <w:t>&gt;¥3000</w:t>
       </w:r>
@@ -423,7 +423,7 @@
         <w:rPr>
           <w:b w:val="0"/>
           <w:color w:val="222222"/>
-          <w:sz w:val="18"/>
+          <w:sz w:val="17"/>
         </w:rPr>
         <w:t xml:space="preserve">、有机构 </w:t>
       </w:r>
@@ -431,7 +431,7 @@
         <w:rPr>
           <w:b/>
           <w:color w:val="222222"/>
-          <w:sz w:val="18"/>
+          <w:sz w:val="17"/>
         </w:rPr>
         <w:t>¥5800/月</w:t>
       </w:r>
@@ -439,7 +439,7 @@
         <w:rPr>
           <w:b w:val="0"/>
           <w:color w:val="222222"/>
-          <w:sz w:val="18"/>
+          <w:sz w:val="17"/>
         </w:rPr>
         <w:t xml:space="preserve">；央视网报道宠物学校 1–2 个月 </w:t>
       </w:r>
@@ -447,7 +447,7 @@
         <w:rPr>
           <w:b/>
           <w:color w:val="222222"/>
-          <w:sz w:val="18"/>
+          <w:sz w:val="17"/>
         </w:rPr>
         <w:t>¥3500–4500</w:t>
       </w:r>
@@ -455,7 +455,7 @@
         <w:rPr>
           <w:b w:val="0"/>
           <w:color w:val="222222"/>
-          <w:sz w:val="18"/>
+          <w:sz w:val="17"/>
         </w:rPr>
         <w:t>、线下训练从几千到上万——即使效果不稳定，用户仍在花钱。</w:t>
       </w:r>
@@ -469,7 +469,7 @@
         <w:rPr>
           <w:b w:val="0"/>
           <w:color w:val="222222"/>
-          <w:sz w:val="18"/>
+          <w:sz w:val="17"/>
         </w:rPr>
         <w:t xml:space="preserve">• </w:t>
       </w:r>
@@ -477,7 +477,7 @@
         <w:rPr>
           <w:b/>
           <w:color w:val="222222"/>
-          <w:sz w:val="18"/>
+          <w:sz w:val="17"/>
         </w:rPr>
         <w:t>小红书 / 淘宝真实评论（社群观察）</w:t>
       </w:r>
@@ -485,7 +485,7 @@
         <w:rPr>
           <w:b w:val="0"/>
           <w:color w:val="222222"/>
-          <w:sz w:val="18"/>
+          <w:sz w:val="17"/>
         </w:rPr>
         <w:t>：小红书用户“出门练习这个点，要等狗不叫了再回来，还是就是出门两分钟就回来，不管它叫不叫”（反映方法执行难、缺即时反馈）；淘宝训犬课买家“之前还花了快一万块把他送去训狗基地，原本有好转了但一出门还是被打回原形，疯狂拆家，有吃的也不吃，已经被投诉好几次了……已经想弃养了”（线下贵且反弹、痛点极强）。原始截图见代码仓库 evidence/ 目录。</w:t>
       </w:r>
@@ -499,7 +499,7 @@
         <w:rPr>
           <w:b w:val="0"/>
           <w:color w:val="222222"/>
-          <w:sz w:val="18"/>
+          <w:sz w:val="17"/>
         </w:rPr>
         <w:t xml:space="preserve">• </w:t>
       </w:r>
@@ -507,7 +507,7 @@
         <w:rPr>
           <w:b/>
           <w:color w:val="222222"/>
-          <w:sz w:val="18"/>
+          <w:sz w:val="17"/>
         </w:rPr>
         <w:t>市场盘</w:t>
       </w:r>
@@ -515,7 +515,7 @@
         <w:rPr>
           <w:b w:val="0"/>
           <w:color w:val="222222"/>
-          <w:sz w:val="18"/>
+          <w:sz w:val="17"/>
         </w:rPr>
         <w:t xml:space="preserve">：央视网《2026 中国宠物行业白皮书》报道——2025 城镇犬猫消费 </w:t>
       </w:r>
@@ -523,7 +523,7 @@
         <w:rPr>
           <w:b/>
           <w:color w:val="222222"/>
-          <w:sz w:val="18"/>
+          <w:sz w:val="17"/>
         </w:rPr>
         <w:t>3126 亿</w:t>
       </w:r>
@@ -531,7 +531,7 @@
         <w:rPr>
           <w:b w:val="0"/>
           <w:color w:val="222222"/>
-          <w:sz w:val="18"/>
+          <w:sz w:val="17"/>
         </w:rPr>
         <w:t xml:space="preserve">，单犬年均 </w:t>
       </w:r>
@@ -539,7 +539,7 @@
         <w:rPr>
           <w:b/>
           <w:color w:val="222222"/>
-          <w:sz w:val="18"/>
+          <w:sz w:val="17"/>
         </w:rPr>
         <w:t>¥3006</w:t>
       </w:r>
@@ -547,7 +547,7 @@
         <w:rPr>
           <w:b w:val="0"/>
           <w:color w:val="222222"/>
-          <w:sz w:val="18"/>
+          <w:sz w:val="17"/>
         </w:rPr>
         <w:t xml:space="preserve">，食品 / 医疗 / 用品 / 服务 = 53.7% / 27.6% / 12.2% / </w:t>
       </w:r>
@@ -555,7 +555,7 @@
         <w:rPr>
           <w:b/>
           <w:color w:val="222222"/>
-          <w:sz w:val="18"/>
+          <w:sz w:val="17"/>
         </w:rPr>
         <w:t>6.5%</w:t>
       </w:r>
@@ -563,7 +563,7 @@
         <w:rPr>
           <w:b w:val="0"/>
           <w:color w:val="222222"/>
-          <w:sz w:val="18"/>
+          <w:sz w:val="17"/>
         </w:rPr>
         <w:t>。</w:t>
       </w:r>
@@ -577,7 +577,7 @@
         <w:rPr>
           <w:b w:val="0"/>
           <w:color w:val="666666"/>
-          <w:sz w:val="18"/>
+          <w:sz w:val="17"/>
         </w:rPr>
         <w:t xml:space="preserve">• </w:t>
       </w:r>
@@ -585,7 +585,7 @@
         <w:rPr>
           <w:b/>
           <w:color w:val="666666"/>
-          <w:sz w:val="18"/>
+          <w:sz w:val="17"/>
         </w:rPr>
         <w:t>证据强度自陈</w:t>
       </w:r>
@@ -593,7 +593,7 @@
         <w:rPr>
           <w:b w:val="0"/>
           <w:color w:val="666666"/>
-          <w:sz w:val="18"/>
+          <w:sz w:val="17"/>
         </w:rPr>
         <w:t>：以上为公开网络资料 / 桌面调研 + 社群观察，</w:t>
       </w:r>
@@ -601,7 +601,7 @@
         <w:rPr>
           <w:b/>
           <w:color w:val="666666"/>
-          <w:sz w:val="18"/>
+          <w:sz w:val="17"/>
         </w:rPr>
         <w:t>尚未做一手访谈或问卷</w:t>
       </w:r>
@@ -609,7 +609,7 @@
         <w:rPr>
           <w:b w:val="0"/>
           <w:color w:val="666666"/>
-          <w:sz w:val="18"/>
+          <w:sz w:val="17"/>
         </w:rPr>
         <w:t>；“3–7 天放弃”是我从求助帖归纳的待验证假设，不是实测数据，已列为 ⑤ 第一步的校准目标。</w:t>
       </w:r>
@@ -622,7 +622,7 @@
         <w:rPr>
           <w:b/>
           <w:color w:val="2F5B4C"/>
-          <w:sz w:val="20"/>
+          <w:sz w:val="19"/>
         </w:rPr>
         <w:t>③ MVP 样例（可运行 Demo，非原型图）</w:t>
       </w:r>
@@ -636,7 +636,7 @@
         <w:rPr>
           <w:b w:val="0"/>
           <w:color w:val="222222"/>
-          <w:sz w:val="18"/>
+          <w:sz w:val="17"/>
         </w:rPr>
         <w:t xml:space="preserve">• </w:t>
       </w:r>
@@ -644,7 +644,7 @@
         <w:rPr>
           <w:b/>
           <w:color w:val="222222"/>
-          <w:sz w:val="18"/>
+          <w:sz w:val="17"/>
         </w:rPr>
         <w:t>三段式 AI 工作流（核心资产）</w:t>
       </w:r>
@@ -652,7 +652,7 @@
         <w:rPr>
           <w:b w:val="0"/>
           <w:color w:val="222222"/>
-          <w:sz w:val="18"/>
+          <w:sz w:val="17"/>
         </w:rPr>
         <w:t>：Stage1 把零散口语</w:t>
       </w:r>
@@ -660,7 +660,7 @@
         <w:rPr>
           <w:b/>
           <w:color w:val="222222"/>
-          <w:sz w:val="18"/>
+          <w:sz w:val="17"/>
         </w:rPr>
         <w:t>结构化</w:t>
       </w:r>
@@ -668,7 +668,7 @@
         <w:rPr>
           <w:b w:val="0"/>
           <w:color w:val="222222"/>
-          <w:sz w:val="18"/>
+          <w:sz w:val="17"/>
         </w:rPr>
         <w:t>成宠物画像；Stage2 输出</w:t>
       </w:r>
@@ -676,7 +676,7 @@
         <w:rPr>
           <w:b/>
           <w:color w:val="222222"/>
-          <w:sz w:val="18"/>
+          <w:sz w:val="17"/>
         </w:rPr>
         <w:t>行为根因诊断 + 严重度分级(low/medium/high) + 医疗边界</w:t>
       </w:r>
@@ -684,7 +684,7 @@
         <w:rPr>
           <w:b w:val="0"/>
           <w:color w:val="222222"/>
-          <w:sz w:val="18"/>
+          <w:sz w:val="17"/>
         </w:rPr>
         <w:t xml:space="preserve">（疑似疾病即建议就医）；Stage3 生成 </w:t>
       </w:r>
@@ -692,7 +692,7 @@
         <w:rPr>
           <w:b/>
           <w:color w:val="222222"/>
-          <w:sz w:val="18"/>
+          <w:sz w:val="17"/>
         </w:rPr>
         <w:t>4–8 周训练计划</w:t>
       </w:r>
@@ -700,7 +700,7 @@
         <w:rPr>
           <w:b w:val="0"/>
           <w:color w:val="222222"/>
-          <w:sz w:val="18"/>
+          <w:sz w:val="17"/>
         </w:rPr>
         <w:t>（每周目标、每日任务“做什么 / 多久 / 成功标准”、所需道具、安全红线）。三段 Prompt 均强约束只输出 JSON，前端稳定渲染。</w:t>
       </w:r>
@@ -714,7 +714,7 @@
         <w:rPr>
           <w:b w:val="0"/>
           <w:color w:val="222222"/>
-          <w:sz w:val="18"/>
+          <w:sz w:val="17"/>
         </w:rPr>
         <w:t xml:space="preserve">• </w:t>
       </w:r>
@@ -722,7 +722,7 @@
         <w:rPr>
           <w:b/>
           <w:color w:val="222222"/>
-          <w:sz w:val="18"/>
+          <w:sz w:val="17"/>
         </w:rPr>
         <w:t>技术栈</w:t>
       </w:r>
@@ -730,7 +730,7 @@
         <w:rPr>
           <w:b w:val="0"/>
           <w:color w:val="222222"/>
-          <w:sz w:val="18"/>
+          <w:sz w:val="17"/>
         </w:rPr>
         <w:t>：Next.js(App Router) + TypeScript + Tailwind；`/api/coach` 串行编排三段；DeepSeek live / 确定性 mock 双模式；Zod 输入校验 + live 输出结构兜底（异常回退 mock）；Vitest 测试覆盖。</w:t>
       </w:r>
@@ -744,7 +744,7 @@
         <w:rPr>
           <w:b w:val="0"/>
           <w:color w:val="222222"/>
-          <w:sz w:val="18"/>
+          <w:sz w:val="17"/>
         </w:rPr>
         <w:t xml:space="preserve">• </w:t>
       </w:r>
@@ -752,7 +752,7 @@
         <w:rPr>
           <w:b/>
           <w:color w:val="222222"/>
-          <w:sz w:val="18"/>
+          <w:sz w:val="17"/>
         </w:rPr>
         <w:t>已完成</w:t>
       </w:r>
@@ -760,7 +760,7 @@
         <w:rPr>
           <w:b w:val="0"/>
           <w:color w:val="222222"/>
-          <w:sz w:val="18"/>
+          <w:sz w:val="17"/>
         </w:rPr>
         <w:t>：结果页（诊断卡 / 严重度刻度 / 6 周计划手风琴 / 安全红线 / 一次性免责声明）、本地打卡进度、localStorage 持久化、基于完成率的规则化次日提示（最小陪跑闭环）。</w:t>
       </w:r>
@@ -774,7 +774,7 @@
         <w:rPr>
           <w:b w:val="0"/>
           <w:color w:val="666666"/>
-          <w:sz w:val="18"/>
+          <w:sz w:val="17"/>
         </w:rPr>
         <w:t xml:space="preserve">• </w:t>
       </w:r>
@@ -782,7 +782,7 @@
         <w:rPr>
           <w:b/>
           <w:color w:val="666666"/>
-          <w:sz w:val="18"/>
+          <w:sz w:val="17"/>
         </w:rPr>
         <w:t>诚实边界</w:t>
       </w:r>
@@ -790,7 +790,7 @@
         <w:rPr>
           <w:b w:val="0"/>
           <w:color w:val="666666"/>
-          <w:sz w:val="18"/>
+          <w:sz w:val="17"/>
         </w:rPr>
         <w:t>：当前“次日提示”是前端规则演示，</w:t>
       </w:r>
@@ -798,7 +798,7 @@
         <w:rPr>
           <w:b/>
           <w:color w:val="666666"/>
-          <w:sz w:val="18"/>
+          <w:sz w:val="17"/>
         </w:rPr>
         <w:t>不是 AI 回传微调</w:t>
       </w:r>
@@ -806,7 +806,7 @@
         <w:rPr>
           <w:b w:val="0"/>
           <w:color w:val="666666"/>
-          <w:sz w:val="18"/>
+          <w:sz w:val="17"/>
         </w:rPr>
         <w:t>；deepseek-chat 不读取图片 / 视频——这两块（AI 微调 + 视频理解）是下一步、也是真正的护城河。</w:t>
       </w:r>
@@ -819,7 +819,7 @@
         <w:rPr>
           <w:b/>
           <w:color w:val="2F5B4C"/>
-          <w:sz w:val="20"/>
+          <w:sz w:val="19"/>
         </w:rPr>
         <w:t>④ 商业判断</w:t>
       </w:r>
@@ -833,7 +833,7 @@
         <w:rPr>
           <w:b w:val="0"/>
           <w:color w:val="222222"/>
-          <w:sz w:val="18"/>
+          <w:sz w:val="17"/>
         </w:rPr>
         <w:t xml:space="preserve">• </w:t>
       </w:r>
@@ -841,7 +841,7 @@
         <w:rPr>
           <w:b/>
           <w:color w:val="222222"/>
-          <w:sz w:val="18"/>
+          <w:sz w:val="17"/>
         </w:rPr>
         <w:t>谁付费</w:t>
       </w:r>
@@ -849,7 +849,7 @@
         <w:rPr>
           <w:b w:val="0"/>
           <w:color w:val="222222"/>
-          <w:sz w:val="18"/>
+          <w:sz w:val="17"/>
         </w:rPr>
         <w:t>：愿为狗花钱（单犬年均 ¥3006）、习惯线上订阅、被线下“贵且反弹”劝退的新手养狗人。</w:t>
       </w:r>
@@ -863,7 +863,7 @@
         <w:rPr>
           <w:b w:val="0"/>
           <w:color w:val="222222"/>
-          <w:sz w:val="18"/>
+          <w:sz w:val="17"/>
         </w:rPr>
         <w:t xml:space="preserve">• </w:t>
       </w:r>
@@ -871,7 +871,7 @@
         <w:rPr>
           <w:b/>
           <w:color w:val="222222"/>
-          <w:sz w:val="18"/>
+          <w:sz w:val="17"/>
         </w:rPr>
         <w:t>为什么付费</w:t>
       </w:r>
@@ -879,7 +879,7 @@
         <w:rPr>
           <w:b w:val="0"/>
           <w:color w:val="222222"/>
-          <w:sz w:val="18"/>
+          <w:sz w:val="17"/>
         </w:rPr>
         <w:t>：买的不是知识（免费遍地），是“</w:t>
       </w:r>
@@ -887,7 +887,7 @@
         <w:rPr>
           <w:b/>
           <w:color w:val="222222"/>
-          <w:sz w:val="18"/>
+          <w:sz w:val="17"/>
         </w:rPr>
         <w:t>坚持执行 + 持续反馈 + 真见效</w:t>
       </w:r>
@@ -895,7 +895,7 @@
         <w:rPr>
           <w:b w:val="0"/>
           <w:color w:val="222222"/>
-          <w:sz w:val="18"/>
+          <w:sz w:val="17"/>
         </w:rPr>
         <w:t>”——比线下便宜约 10 倍、可迁移到主人、全程透明正向强化。</w:t>
       </w:r>
@@ -909,7 +909,7 @@
         <w:rPr>
           <w:b w:val="0"/>
           <w:color w:val="222222"/>
-          <w:sz w:val="18"/>
+          <w:sz w:val="17"/>
         </w:rPr>
         <w:t xml:space="preserve">• </w:t>
       </w:r>
@@ -917,7 +917,7 @@
         <w:rPr>
           <w:b/>
           <w:color w:val="222222"/>
-          <w:sz w:val="18"/>
+          <w:sz w:val="17"/>
         </w:rPr>
         <w:t>定价</w:t>
       </w:r>
@@ -925,7 +925,7 @@
         <w:rPr>
           <w:b w:val="0"/>
           <w:color w:val="222222"/>
-          <w:sz w:val="18"/>
+          <w:sz w:val="17"/>
         </w:rPr>
         <w:t>：免费诊断 + 周计划做</w:t>
       </w:r>
@@ -933,7 +933,7 @@
         <w:rPr>
           <w:b/>
           <w:color w:val="222222"/>
-          <w:sz w:val="18"/>
+          <w:sz w:val="17"/>
         </w:rPr>
         <w:t>获客钩子</w:t>
       </w:r>
@@ -941,7 +941,7 @@
         <w:rPr>
           <w:b w:val="0"/>
           <w:color w:val="222222"/>
-          <w:sz w:val="18"/>
+          <w:sz w:val="17"/>
         </w:rPr>
         <w:t xml:space="preserve"> → </w:t>
       </w:r>
@@ -949,7 +949,7 @@
         <w:rPr>
           <w:b/>
           <w:color w:val="222222"/>
-          <w:sz w:val="18"/>
+          <w:sz w:val="17"/>
         </w:rPr>
         <w:t>¥99「6 周训练营」一次性</w:t>
       </w:r>
@@ -957,7 +957,7 @@
         <w:rPr>
           <w:b w:val="0"/>
           <w:color w:val="222222"/>
-          <w:sz w:val="18"/>
+          <w:sz w:val="17"/>
         </w:rPr>
         <w:t xml:space="preserve">（锚定线下 ¥1000+，一次性买断降低“中途没坚持就退订”的流失，转化优于月订阅） → 训练中推荐围栏 / 漏食球 / 嗅闻垫 / 零食，赚 </w:t>
       </w:r>
@@ -965,7 +965,7 @@
         <w:rPr>
           <w:b/>
           <w:color w:val="222222"/>
-          <w:sz w:val="18"/>
+          <w:sz w:val="17"/>
         </w:rPr>
         <w:t>CPS 导购佣金</w:t>
       </w:r>
@@ -973,7 +973,7 @@
         <w:rPr>
           <w:b w:val="0"/>
           <w:color w:val="222222"/>
-          <w:sz w:val="18"/>
+          <w:sz w:val="17"/>
         </w:rPr>
         <w:t>。</w:t>
       </w:r>
@@ -987,7 +987,7 @@
         <w:rPr>
           <w:b w:val="0"/>
           <w:color w:val="222222"/>
-          <w:sz w:val="18"/>
+          <w:sz w:val="17"/>
         </w:rPr>
         <w:t xml:space="preserve">• </w:t>
       </w:r>
@@ -995,7 +995,7 @@
         <w:rPr>
           <w:b/>
           <w:color w:val="222222"/>
-          <w:sz w:val="18"/>
+          <w:sz w:val="17"/>
         </w:rPr>
         <w:t>获客</w:t>
       </w:r>
@@ -1003,7 +1003,7 @@
         <w:rPr>
           <w:b w:val="0"/>
           <w:color w:val="222222"/>
-          <w:sz w:val="18"/>
+          <w:sz w:val="17"/>
         </w:rPr>
         <w:t>：小红书 / 抖音 before-after 打卡视频（天然可传播）、狗主社群裂变、宠粮 / 用品 KOL 合作、长尾 SEO（“XX 犬拆家怎么办”）。</w:t>
       </w:r>
@@ -1011,7 +1011,7 @@
         <w:rPr>
           <w:b/>
           <w:color w:val="222222"/>
-          <w:sz w:val="18"/>
+          <w:sz w:val="17"/>
         </w:rPr>
         <w:t>诚实标注</w:t>
       </w:r>
@@ -1019,7 +1019,7 @@
         <w:rPr>
           <w:b w:val="0"/>
           <w:color w:val="222222"/>
-          <w:sz w:val="18"/>
+          <w:sz w:val="17"/>
         </w:rPr>
         <w:t>：付费意愿目前仅间接证据，真实转化用 waitlist + 假付费按钮实测；before-after 依赖真实见效，不在验证前当作已成立。</w:t>
       </w:r>
@@ -1032,7 +1032,7 @@
         <w:rPr>
           <w:b/>
           <w:color w:val="2F5B4C"/>
-          <w:sz w:val="20"/>
+          <w:sz w:val="19"/>
         </w:rPr>
         <w:t>⑤ 2 周验证计划（每步：验证什么 + 资源 + go / no-go）</w:t>
       </w:r>
@@ -1046,7 +1046,7 @@
         <w:rPr>
           <w:b w:val="0"/>
           <w:color w:val="222222"/>
-          <w:sz w:val="18"/>
+          <w:sz w:val="17"/>
         </w:rPr>
         <w:t xml:space="preserve">• </w:t>
       </w:r>
@@ -1054,7 +1054,7 @@
         <w:rPr>
           <w:b/>
           <w:color w:val="222222"/>
-          <w:sz w:val="18"/>
+          <w:sz w:val="17"/>
         </w:rPr>
         <w:t>Week 1 · 需求验证（尚未开始，为计划）</w:t>
       </w:r>
@@ -1062,7 +1062,7 @@
         <w:rPr>
           <w:b w:val="0"/>
           <w:color w:val="222222"/>
-          <w:sz w:val="18"/>
+          <w:sz w:val="17"/>
         </w:rPr>
         <w:t xml:space="preserve">：深访 </w:t>
       </w:r>
@@ -1070,7 +1070,7 @@
         <w:rPr>
           <w:b/>
           <w:color w:val="222222"/>
-          <w:sz w:val="18"/>
+          <w:sz w:val="17"/>
         </w:rPr>
         <w:t>10 位</w:t>
       </w:r>
@@ -1078,7 +1078,7 @@
         <w:rPr>
           <w:b w:val="0"/>
           <w:color w:val="222222"/>
-          <w:sz w:val="18"/>
+          <w:sz w:val="17"/>
         </w:rPr>
         <w:t xml:space="preserve">新手狗主（小红书私信 / 社群 / 问卷星），校准“放弃时点”与付费意愿；上线 Landing Page，投 </w:t>
       </w:r>
@@ -1086,7 +1086,7 @@
         <w:rPr>
           <w:b/>
           <w:color w:val="222222"/>
-          <w:sz w:val="18"/>
+          <w:sz w:val="17"/>
         </w:rPr>
         <w:t>¥200–500</w:t>
       </w:r>
@@ -1094,7 +1094,7 @@
         <w:rPr>
           <w:b w:val="0"/>
           <w:color w:val="222222"/>
-          <w:sz w:val="18"/>
+          <w:sz w:val="17"/>
         </w:rPr>
         <w:t xml:space="preserve"> 测“点击 → 留资”。</w:t>
       </w:r>
@@ -1102,7 +1102,7 @@
         <w:rPr>
           <w:b/>
           <w:color w:val="222222"/>
-          <w:sz w:val="18"/>
+          <w:sz w:val="17"/>
         </w:rPr>
         <w:t>阈值</w:t>
       </w:r>
@@ -1110,7 +1110,7 @@
         <w:rPr>
           <w:b w:val="0"/>
           <w:color w:val="222222"/>
-          <w:sz w:val="18"/>
+          <w:sz w:val="17"/>
         </w:rPr>
         <w:t>：留资率 ≥ 10%；≥ 6/10 能说出明确放弃时点或卡住原因。</w:t>
       </w:r>
@@ -1124,7 +1124,7 @@
         <w:rPr>
           <w:b w:val="0"/>
           <w:color w:val="222222"/>
-          <w:sz w:val="18"/>
+          <w:sz w:val="17"/>
         </w:rPr>
         <w:t xml:space="preserve">• </w:t>
       </w:r>
@@ -1132,7 +1132,7 @@
         <w:rPr>
           <w:b/>
           <w:color w:val="222222"/>
-          <w:sz w:val="18"/>
+          <w:sz w:val="17"/>
         </w:rPr>
         <w:t>Week 2 · 产品验证</w:t>
       </w:r>
@@ -1140,7 +1140,7 @@
         <w:rPr>
           <w:b w:val="0"/>
           <w:color w:val="222222"/>
-          <w:sz w:val="18"/>
+          <w:sz w:val="17"/>
         </w:rPr>
         <w:t xml:space="preserve">：邀 </w:t>
       </w:r>
@@ -1148,7 +1148,7 @@
         <w:rPr>
           <w:b/>
           <w:color w:val="222222"/>
-          <w:sz w:val="18"/>
+          <w:sz w:val="17"/>
         </w:rPr>
         <w:t>10 人真实试用 14 天</w:t>
       </w:r>
@@ -1156,7 +1156,7 @@
         <w:rPr>
           <w:b w:val="0"/>
           <w:color w:val="222222"/>
-          <w:sz w:val="18"/>
+          <w:sz w:val="17"/>
         </w:rPr>
         <w:t xml:space="preserve">（窗口按“见效需数周”设 14 天，不是 7 天）。核心指标 = </w:t>
       </w:r>
@@ -1164,7 +1164,7 @@
         <w:rPr>
           <w:b/>
           <w:color w:val="222222"/>
-          <w:sz w:val="18"/>
+          <w:sz w:val="17"/>
         </w:rPr>
         <w:t>D7/D14 留存 + 每日打卡完成率 + 连续 3 天完成占比 + 假付费点击转化 + NPS</w:t>
       </w:r>
@@ -1172,7 +1172,7 @@
         <w:rPr>
           <w:b w:val="0"/>
           <w:color w:val="222222"/>
-          <w:sz w:val="18"/>
+          <w:sz w:val="17"/>
         </w:rPr>
         <w:t>。</w:t>
       </w:r>
@@ -1180,7 +1180,7 @@
         <w:rPr>
           <w:b/>
           <w:color w:val="222222"/>
-          <w:sz w:val="18"/>
+          <w:sz w:val="17"/>
         </w:rPr>
         <w:t>go/no-go</w:t>
       </w:r>
@@ -1188,7 +1188,7 @@
         <w:rPr>
           <w:b w:val="0"/>
           <w:color w:val="222222"/>
-          <w:sz w:val="18"/>
+          <w:sz w:val="17"/>
         </w:rPr>
         <w:t>：D14 留存 ≥ 40% 且连续 3 天完成率 ≥ 50% 且假付费转化 ≥ 15% → 继续；否则回炉重想陪跑机制。n=10 只取定性信号与方向，不做统计结论。</w:t>
       </w:r>
@@ -1202,7 +1202,7 @@
         <w:rPr>
           <w:b w:val="0"/>
           <w:color w:val="222222"/>
-          <w:sz w:val="18"/>
+          <w:sz w:val="17"/>
         </w:rPr>
         <w:t xml:space="preserve">• </w:t>
       </w:r>
@@ -1210,7 +1210,7 @@
         <w:rPr>
           <w:b/>
           <w:color w:val="222222"/>
-          <w:sz w:val="18"/>
+          <w:sz w:val="17"/>
         </w:rPr>
         <w:t>资源投入</w:t>
       </w:r>
@@ -1218,7 +1218,7 @@
         <w:rPr>
           <w:b w:val="0"/>
           <w:color w:val="222222"/>
-          <w:sz w:val="18"/>
+          <w:sz w:val="17"/>
         </w:rPr>
         <w:t>：个人时间 4–6h/天、AI API 约 ¥数百、Vercel 免费部署、¥200–500 投放、剪辑 / 问卷工具。</w:t>
       </w:r>
@@ -1226,7 +1226,7 @@
         <w:rPr>
           <w:b/>
           <w:color w:val="222222"/>
-          <w:sz w:val="18"/>
+          <w:sz w:val="17"/>
         </w:rPr>
         <w:t>无需大预算</w:t>
       </w:r>
@@ -1234,7 +1234,7 @@
         <w:rPr>
           <w:b w:val="0"/>
           <w:color w:val="222222"/>
-          <w:sz w:val="18"/>
+          <w:sz w:val="17"/>
         </w:rPr>
         <w:t>。</w:t>
       </w:r>
@@ -1247,7 +1247,7 @@
         <w:rPr>
           <w:b/>
           <w:color w:val="222222"/>
-          <w:sz w:val="18"/>
+          <w:sz w:val="17"/>
         </w:rPr>
         <w:t>在线 Demo：</w:t>
       </w:r>
@@ -1265,7 +1265,7 @@
         <w:rPr>
           <w:b/>
           <w:color w:val="222222"/>
-          <w:sz w:val="18"/>
+          <w:sz w:val="17"/>
         </w:rPr>
         <w:t xml:space="preserve">　｜　代码仓库：</w:t>
       </w:r>
@@ -1282,14 +1282,14 @@
       <w:r>
         <w:rPr>
           <w:color w:val="666666"/>
-          <w:sz w:val="17"/>
+          <w:sz w:val="16"/>
         </w:rPr>
         <w:t xml:space="preserve">　｜　本产品定位行为训练辅助，不替代兽医诊疗。</w:t>
       </w:r>
     </w:p>
     <w:sectPr>
       <w:pgSz w:w="11906" w:h="16838"/>
-      <w:pgMar w:top="567" w:right="567" w:bottom="567" w:left="567" w:header="720" w:footer="720" w:gutter="0"/>
+      <w:pgMar w:top="510" w:right="510" w:bottom="510" w:left="510" w:header="720" w:footer="720" w:gutter="0"/>
       <w:cols w:space="720"/>
       <w:docGrid w:linePitch="360"/>
     </w:sectPr>
@@ -1662,7 +1662,7 @@
     <w:rsid w:val="00FC693F"/>
     <w:rPr>
       <w:rFonts w:ascii="Microsoft YaHei" w:hAnsi="Microsoft YaHei" w:eastAsia="微软雅黑"/>
-      <w:sz w:val="18"/>
+      <w:sz w:val="17"/>
     </w:rPr>
   </w:style>
   <w:style w:type="paragraph" w:styleId="Header">

</xml_diff>